<commit_message>
Tambah kolom Catatan pada tabel penilaian instrumen validasi
Co-authored-by: Irasllsa <291213148+Irasllsa@users.noreply.github.com>
</commit_message>
<xml_diff>
--- a/INSTRUMEN VALIDASI AHLI MATERI revised (1).docx
+++ b/INSTRUMEN VALIDASI AHLI MATERI revised (1).docx
@@ -1597,7 +1597,7 @@
     </w:p>
     <w:tbl>
       <w:tblPr>
-        <w:tblW w:w="4605" w:type="pct"/>
+        <w:tblW w:w="9026" w:type="dxa"/>
         <w:tblBorders>
           <w:top w:val="single" w:sz="6" w:space="0" w:color="000000"/>
           <w:left w:val="single" w:sz="6" w:space="0" w:color="000000"/>
@@ -1613,17 +1613,18 @@
         <w:tblLook w:val="04A0" w:firstRow="1" w:lastRow="0" w:firstColumn="1" w:lastColumn="0" w:noHBand="0" w:noVBand="1"/>
       </w:tblPr>
       <w:tblGrid>
-        <w:gridCol w:w="510"/>
-        <w:gridCol w:w="4948"/>
-        <w:gridCol w:w="710"/>
-        <w:gridCol w:w="710"/>
-        <w:gridCol w:w="710"/>
-        <w:gridCol w:w="710"/>
+        <w:gridCol w:w="480"/>
+        <w:gridCol w:w="4100"/>
+        <w:gridCol w:w="420"/>
+        <w:gridCol w:w="420"/>
+        <w:gridCol w:w="420"/>
+        <w:gridCol w:w="420"/>
+        <w:gridCol w:w="2766"/>
       </w:tblGrid>
       <w:tr>
         <w:tc>
           <w:tcPr>
-            <w:tcW w:w="307" w:type="pct"/>
+            <w:tcW w:w="480" w:type="dxa"/>
             <w:tcBorders>
               <w:top w:val="single" w:sz="6" w:space="0" w:color="000000"/>
               <w:left w:val="single" w:sz="6" w:space="0" w:color="000000"/>
@@ -1664,7 +1665,7 @@
         </w:tc>
         <w:tc>
           <w:tcPr>
-            <w:tcW w:w="2980" w:type="pct"/>
+            <w:tcW w:w="4100" w:type="dxa"/>
             <w:tcBorders>
               <w:top w:val="single" w:sz="6" w:space="0" w:color="000000"/>
               <w:left w:val="single" w:sz="6" w:space="0" w:color="000000"/>
@@ -1707,7 +1708,7 @@
         </w:tc>
         <w:tc>
           <w:tcPr>
-            <w:tcW w:w="428" w:type="pct"/>
+            <w:tcW w:w="420" w:type="dxa"/>
             <w:tcBorders>
               <w:top w:val="single" w:sz="6" w:space="0" w:color="000000"/>
               <w:left w:val="single" w:sz="6" w:space="0" w:color="000000"/>
@@ -1748,7 +1749,7 @@
         </w:tc>
         <w:tc>
           <w:tcPr>
-            <w:tcW w:w="428" w:type="pct"/>
+            <w:tcW w:w="420" w:type="dxa"/>
             <w:tcBorders>
               <w:top w:val="single" w:sz="6" w:space="0" w:color="000000"/>
               <w:left w:val="single" w:sz="6" w:space="0" w:color="000000"/>
@@ -1789,7 +1790,7 @@
         </w:tc>
         <w:tc>
           <w:tcPr>
-            <w:tcW w:w="428" w:type="pct"/>
+            <w:tcW w:w="420" w:type="dxa"/>
             <w:tcBorders>
               <w:top w:val="single" w:sz="6" w:space="0" w:color="000000"/>
               <w:left w:val="single" w:sz="6" w:space="0" w:color="000000"/>
@@ -1830,7 +1831,7 @@
         </w:tc>
         <w:tc>
           <w:tcPr>
-            <w:tcW w:w="428" w:type="pct"/>
+            <w:tcW w:w="420" w:type="dxa"/>
             <w:tcBorders>
               <w:top w:val="single" w:sz="6" w:space="0" w:color="000000"/>
               <w:left w:val="single" w:sz="6" w:space="0" w:color="000000"/>
@@ -1869,11 +1870,55 @@
             </w:r>
           </w:p>
         </w:tc>
+        <w:tc>
+          <w:tcPr>
+            <w:tcW w:w="2766" w:type="dxa"/>
+            <w:tcBorders>
+              <w:top w:val="single" w:sz="6" w:space="0" w:color="000000"/>
+              <w:left w:val="single" w:sz="6" w:space="0" w:color="000000"/>
+              <w:bottom w:val="single" w:sz="6" w:space="0" w:color="000000"/>
+              <w:right w:val="single" w:sz="6" w:space="0" w:color="000000"/>
+            </w:tcBorders>
+            <w:shd w:val="clear" w:color="auto" w:fill="F0F0F0"/>
+            <w:tcMar>
+              <w:top w:w="120" w:type="dxa"/>
+              <w:left w:w="120" w:type="dxa"/>
+              <w:bottom w:w="120" w:type="dxa"/>
+              <w:right w:w="120" w:type="dxa"/>
+            </w:tcMar>
+            <w:vAlign w:val="center"/>
+            <w:hideMark/>
+          </w:tcPr>
+          <w:p>
+            <w:pPr>
+              <w:spacing w:before="200" w:after="200" w:line="240" w:lineRule="auto"/>
+              <w:jc w:val="center"/>
+              <w:rPr>
+                <w:rFonts w:ascii="Times New Roman" w:eastAsia="Times New Roman" w:hAnsi="Times New Roman" w:cs="Times New Roman"/>
+                <w:b/>
+                <w:bCs/>
+                <w:lang w:eastAsia="en-ID"/>
+              </w:rPr>
+            </w:pPr>
+            <w:r>
+              <w:rPr>
+                <w:rFonts w:ascii="Times New Roman" w:eastAsia="Times New Roman" w:hAnsi="Times New Roman" w:cs="Times New Roman"/>
+                <w:b/>
+                <w:bCs/>
+                <w:lang w:eastAsia="en-ID"/>
+              </w:rPr>
+              <w:t>Catatan</w:t>
+            </w:r>
+          </w:p>
+        </w:tc>
       </w:tr>
       <w:tr>
-        <w:tc>
-          <w:tcPr>
-            <w:tcW w:w="0" w:type="auto"/>
+        <w:trPr>
+          <w:trHeight w:val="624" w:hRule="atLeast"/>
+        </w:trPr>
+        <w:tc>
+          <w:tcPr>
+            <w:tcW w:w="480" w:type="dxa"/>
             <w:tcBorders>
               <w:top w:val="single" w:sz="6" w:space="0" w:color="000000"/>
               <w:left w:val="single" w:sz="6" w:space="0" w:color="000000"/>
@@ -1908,7 +1953,7 @@
         </w:tc>
         <w:tc>
           <w:tcPr>
-            <w:tcW w:w="0" w:type="auto"/>
+            <w:tcW w:w="4100" w:type="dxa"/>
             <w:tcBorders>
               <w:top w:val="single" w:sz="6" w:space="0" w:color="000000"/>
               <w:left w:val="single" w:sz="6" w:space="0" w:color="000000"/>
@@ -2152,34 +2197,34 @@
         </w:tc>
         <w:tc>
           <w:tcPr>
-            <w:tcW w:w="0" w:type="auto"/>
-            <w:tcBorders>
-              <w:top w:val="single" w:sz="6" w:space="0" w:color="000000"/>
-              <w:left w:val="single" w:sz="6" w:space="0" w:color="000000"/>
-              <w:bottom w:val="single" w:sz="6" w:space="0" w:color="000000"/>
-              <w:right w:val="single" w:sz="6" w:space="0" w:color="000000"/>
-            </w:tcBorders>
-            <w:tcMar>
-              <w:top w:w="120" w:type="dxa"/>
-              <w:left w:w="120" w:type="dxa"/>
-              <w:bottom w:w="120" w:type="dxa"/>
-              <w:right w:w="120" w:type="dxa"/>
-            </w:tcMar>
-            <w:hideMark/>
-          </w:tcPr>
-          <w:p>
-            <w:pPr>
-              <w:spacing w:before="200" w:after="200" w:line="240" w:lineRule="auto"/>
-              <w:rPr>
-                <w:rFonts w:ascii="Times New Roman" w:eastAsia="Times New Roman" w:hAnsi="Times New Roman" w:cs="Times New Roman"/>
-                <w:lang w:eastAsia="en-ID"/>
-              </w:rPr>
-            </w:pPr>
-          </w:p>
-        </w:tc>
-        <w:tc>
-          <w:tcPr>
-            <w:tcW w:w="0" w:type="auto"/>
+            <w:tcW w:w="420" w:type="dxa"/>
+            <w:tcBorders>
+              <w:top w:val="single" w:sz="6" w:space="0" w:color="000000"/>
+              <w:left w:val="single" w:sz="6" w:space="0" w:color="000000"/>
+              <w:bottom w:val="single" w:sz="6" w:space="0" w:color="000000"/>
+              <w:right w:val="single" w:sz="6" w:space="0" w:color="000000"/>
+            </w:tcBorders>
+            <w:tcMar>
+              <w:top w:w="120" w:type="dxa"/>
+              <w:left w:w="120" w:type="dxa"/>
+              <w:bottom w:w="120" w:type="dxa"/>
+              <w:right w:w="120" w:type="dxa"/>
+            </w:tcMar>
+            <w:hideMark/>
+          </w:tcPr>
+          <w:p>
+            <w:pPr>
+              <w:spacing w:before="200" w:after="200" w:line="240" w:lineRule="auto"/>
+              <w:rPr>
+                <w:rFonts w:ascii="Times New Roman" w:eastAsia="Times New Roman" w:hAnsi="Times New Roman" w:cs="Times New Roman"/>
+                <w:lang w:eastAsia="en-ID"/>
+              </w:rPr>
+            </w:pPr>
+          </w:p>
+        </w:tc>
+        <w:tc>
+          <w:tcPr>
+            <w:tcW w:w="420" w:type="dxa"/>
             <w:tcBorders>
               <w:top w:val="single" w:sz="6" w:space="0" w:color="000000"/>
               <w:left w:val="single" w:sz="6" w:space="0" w:color="000000"/>
@@ -2208,7 +2253,7 @@
         </w:tc>
         <w:tc>
           <w:tcPr>
-            <w:tcW w:w="0" w:type="auto"/>
+            <w:tcW w:w="420" w:type="dxa"/>
             <w:tcBorders>
               <w:top w:val="single" w:sz="6" w:space="0" w:color="000000"/>
               <w:left w:val="single" w:sz="6" w:space="0" w:color="000000"/>
@@ -2237,7 +2282,7 @@
         </w:tc>
         <w:tc>
           <w:tcPr>
-            <w:tcW w:w="0" w:type="auto"/>
+            <w:tcW w:w="420" w:type="dxa"/>
             <w:tcBorders>
               <w:top w:val="single" w:sz="6" w:space="0" w:color="000000"/>
               <w:left w:val="single" w:sz="6" w:space="0" w:color="000000"/>
@@ -2264,11 +2309,41 @@
             </w:pPr>
           </w:p>
         </w:tc>
+        <w:tc>
+          <w:tcPr>
+            <w:tcW w:w="2766" w:type="dxa"/>
+            <w:tcBorders>
+              <w:top w:val="single" w:sz="6" w:space="0" w:color="000000"/>
+              <w:left w:val="single" w:sz="6" w:space="0" w:color="000000"/>
+              <w:bottom w:val="single" w:sz="6" w:space="0" w:color="000000"/>
+              <w:right w:val="single" w:sz="6" w:space="0" w:color="000000"/>
+            </w:tcBorders>
+            <w:tcMar>
+              <w:top w:w="120" w:type="dxa"/>
+              <w:left w:w="120" w:type="dxa"/>
+              <w:bottom w:w="120" w:type="dxa"/>
+              <w:right w:w="120" w:type="dxa"/>
+            </w:tcMar>
+            <w:hideMark/>
+          </w:tcPr>
+          <w:p>
+            <w:pPr>
+              <w:spacing w:before="200" w:after="200" w:line="240" w:lineRule="auto"/>
+              <w:rPr>
+                <w:rFonts w:ascii="Times New Roman" w:eastAsia="Times New Roman" w:hAnsi="Times New Roman" w:cs="Times New Roman"/>
+                <w:lang w:eastAsia="en-ID"/>
+              </w:rPr>
+            </w:pPr>
+          </w:p>
+        </w:tc>
       </w:tr>
       <w:tr>
-        <w:tc>
-          <w:tcPr>
-            <w:tcW w:w="0" w:type="auto"/>
+        <w:trPr>
+          <w:trHeight w:val="624" w:hRule="atLeast"/>
+        </w:trPr>
+        <w:tc>
+          <w:tcPr>
+            <w:tcW w:w="480" w:type="dxa"/>
             <w:tcBorders>
               <w:top w:val="single" w:sz="6" w:space="0" w:color="000000"/>
               <w:left w:val="single" w:sz="6" w:space="0" w:color="000000"/>
@@ -2303,7 +2378,7 @@
         </w:tc>
         <w:tc>
           <w:tcPr>
-            <w:tcW w:w="0" w:type="auto"/>
+            <w:tcW w:w="4100" w:type="dxa"/>
             <w:tcBorders>
               <w:top w:val="single" w:sz="6" w:space="0" w:color="000000"/>
               <w:left w:val="single" w:sz="6" w:space="0" w:color="000000"/>
@@ -2499,34 +2574,34 @@
         </w:tc>
         <w:tc>
           <w:tcPr>
-            <w:tcW w:w="0" w:type="auto"/>
-            <w:tcBorders>
-              <w:top w:val="single" w:sz="6" w:space="0" w:color="000000"/>
-              <w:left w:val="single" w:sz="6" w:space="0" w:color="000000"/>
-              <w:bottom w:val="single" w:sz="6" w:space="0" w:color="000000"/>
-              <w:right w:val="single" w:sz="6" w:space="0" w:color="000000"/>
-            </w:tcBorders>
-            <w:tcMar>
-              <w:top w:w="120" w:type="dxa"/>
-              <w:left w:w="120" w:type="dxa"/>
-              <w:bottom w:w="120" w:type="dxa"/>
-              <w:right w:w="120" w:type="dxa"/>
-            </w:tcMar>
-            <w:hideMark/>
-          </w:tcPr>
-          <w:p>
-            <w:pPr>
-              <w:spacing w:before="200" w:after="200" w:line="240" w:lineRule="auto"/>
-              <w:rPr>
-                <w:rFonts w:ascii="Times New Roman" w:eastAsia="Times New Roman" w:hAnsi="Times New Roman" w:cs="Times New Roman"/>
-                <w:lang w:eastAsia="en-ID"/>
-              </w:rPr>
-            </w:pPr>
-          </w:p>
-        </w:tc>
-        <w:tc>
-          <w:tcPr>
-            <w:tcW w:w="0" w:type="auto"/>
+            <w:tcW w:w="420" w:type="dxa"/>
+            <w:tcBorders>
+              <w:top w:val="single" w:sz="6" w:space="0" w:color="000000"/>
+              <w:left w:val="single" w:sz="6" w:space="0" w:color="000000"/>
+              <w:bottom w:val="single" w:sz="6" w:space="0" w:color="000000"/>
+              <w:right w:val="single" w:sz="6" w:space="0" w:color="000000"/>
+            </w:tcBorders>
+            <w:tcMar>
+              <w:top w:w="120" w:type="dxa"/>
+              <w:left w:w="120" w:type="dxa"/>
+              <w:bottom w:w="120" w:type="dxa"/>
+              <w:right w:w="120" w:type="dxa"/>
+            </w:tcMar>
+            <w:hideMark/>
+          </w:tcPr>
+          <w:p>
+            <w:pPr>
+              <w:spacing w:before="200" w:after="200" w:line="240" w:lineRule="auto"/>
+              <w:rPr>
+                <w:rFonts w:ascii="Times New Roman" w:eastAsia="Times New Roman" w:hAnsi="Times New Roman" w:cs="Times New Roman"/>
+                <w:lang w:eastAsia="en-ID"/>
+              </w:rPr>
+            </w:pPr>
+          </w:p>
+        </w:tc>
+        <w:tc>
+          <w:tcPr>
+            <w:tcW w:w="420" w:type="dxa"/>
             <w:tcBorders>
               <w:top w:val="single" w:sz="6" w:space="0" w:color="000000"/>
               <w:left w:val="single" w:sz="6" w:space="0" w:color="000000"/>
@@ -2555,7 +2630,7 @@
         </w:tc>
         <w:tc>
           <w:tcPr>
-            <w:tcW w:w="0" w:type="auto"/>
+            <w:tcW w:w="420" w:type="dxa"/>
             <w:tcBorders>
               <w:top w:val="single" w:sz="6" w:space="0" w:color="000000"/>
               <w:left w:val="single" w:sz="6" w:space="0" w:color="000000"/>
@@ -2584,7 +2659,7 @@
         </w:tc>
         <w:tc>
           <w:tcPr>
-            <w:tcW w:w="0" w:type="auto"/>
+            <w:tcW w:w="420" w:type="dxa"/>
             <w:tcBorders>
               <w:top w:val="single" w:sz="6" w:space="0" w:color="000000"/>
               <w:left w:val="single" w:sz="6" w:space="0" w:color="000000"/>
@@ -2611,11 +2686,41 @@
             </w:pPr>
           </w:p>
         </w:tc>
+        <w:tc>
+          <w:tcPr>
+            <w:tcW w:w="2766" w:type="dxa"/>
+            <w:tcBorders>
+              <w:top w:val="single" w:sz="6" w:space="0" w:color="000000"/>
+              <w:left w:val="single" w:sz="6" w:space="0" w:color="000000"/>
+              <w:bottom w:val="single" w:sz="6" w:space="0" w:color="000000"/>
+              <w:right w:val="single" w:sz="6" w:space="0" w:color="000000"/>
+            </w:tcBorders>
+            <w:tcMar>
+              <w:top w:w="120" w:type="dxa"/>
+              <w:left w:w="120" w:type="dxa"/>
+              <w:bottom w:w="120" w:type="dxa"/>
+              <w:right w:w="120" w:type="dxa"/>
+            </w:tcMar>
+            <w:hideMark/>
+          </w:tcPr>
+          <w:p>
+            <w:pPr>
+              <w:spacing w:before="200" w:after="200" w:line="240" w:lineRule="auto"/>
+              <w:rPr>
+                <w:rFonts w:ascii="Times New Roman" w:eastAsia="Times New Roman" w:hAnsi="Times New Roman" w:cs="Times New Roman"/>
+                <w:lang w:eastAsia="en-ID"/>
+              </w:rPr>
+            </w:pPr>
+          </w:p>
+        </w:tc>
       </w:tr>
       <w:tr>
-        <w:tc>
-          <w:tcPr>
-            <w:tcW w:w="0" w:type="auto"/>
+        <w:trPr>
+          <w:trHeight w:val="624" w:hRule="atLeast"/>
+        </w:trPr>
+        <w:tc>
+          <w:tcPr>
+            <w:tcW w:w="480" w:type="dxa"/>
             <w:tcBorders>
               <w:top w:val="single" w:sz="6" w:space="0" w:color="000000"/>
               <w:left w:val="single" w:sz="6" w:space="0" w:color="000000"/>
@@ -2650,7 +2755,7 @@
         </w:tc>
         <w:tc>
           <w:tcPr>
-            <w:tcW w:w="0" w:type="auto"/>
+            <w:tcW w:w="4100" w:type="dxa"/>
             <w:tcBorders>
               <w:top w:val="single" w:sz="6" w:space="0" w:color="000000"/>
               <w:left w:val="single" w:sz="6" w:space="0" w:color="000000"/>
@@ -2821,34 +2926,34 @@
         </w:tc>
         <w:tc>
           <w:tcPr>
-            <w:tcW w:w="0" w:type="auto"/>
-            <w:tcBorders>
-              <w:top w:val="single" w:sz="6" w:space="0" w:color="000000"/>
-              <w:left w:val="single" w:sz="6" w:space="0" w:color="000000"/>
-              <w:bottom w:val="single" w:sz="6" w:space="0" w:color="000000"/>
-              <w:right w:val="single" w:sz="6" w:space="0" w:color="000000"/>
-            </w:tcBorders>
-            <w:tcMar>
-              <w:top w:w="120" w:type="dxa"/>
-              <w:left w:w="120" w:type="dxa"/>
-              <w:bottom w:w="120" w:type="dxa"/>
-              <w:right w:w="120" w:type="dxa"/>
-            </w:tcMar>
-            <w:hideMark/>
-          </w:tcPr>
-          <w:p>
-            <w:pPr>
-              <w:spacing w:before="200" w:after="200" w:line="240" w:lineRule="auto"/>
-              <w:rPr>
-                <w:rFonts w:ascii="Times New Roman" w:eastAsia="Times New Roman" w:hAnsi="Times New Roman" w:cs="Times New Roman"/>
-                <w:lang w:eastAsia="en-ID"/>
-              </w:rPr>
-            </w:pPr>
-          </w:p>
-        </w:tc>
-        <w:tc>
-          <w:tcPr>
-            <w:tcW w:w="0" w:type="auto"/>
+            <w:tcW w:w="420" w:type="dxa"/>
+            <w:tcBorders>
+              <w:top w:val="single" w:sz="6" w:space="0" w:color="000000"/>
+              <w:left w:val="single" w:sz="6" w:space="0" w:color="000000"/>
+              <w:bottom w:val="single" w:sz="6" w:space="0" w:color="000000"/>
+              <w:right w:val="single" w:sz="6" w:space="0" w:color="000000"/>
+            </w:tcBorders>
+            <w:tcMar>
+              <w:top w:w="120" w:type="dxa"/>
+              <w:left w:w="120" w:type="dxa"/>
+              <w:bottom w:w="120" w:type="dxa"/>
+              <w:right w:w="120" w:type="dxa"/>
+            </w:tcMar>
+            <w:hideMark/>
+          </w:tcPr>
+          <w:p>
+            <w:pPr>
+              <w:spacing w:before="200" w:after="200" w:line="240" w:lineRule="auto"/>
+              <w:rPr>
+                <w:rFonts w:ascii="Times New Roman" w:eastAsia="Times New Roman" w:hAnsi="Times New Roman" w:cs="Times New Roman"/>
+                <w:lang w:eastAsia="en-ID"/>
+              </w:rPr>
+            </w:pPr>
+          </w:p>
+        </w:tc>
+        <w:tc>
+          <w:tcPr>
+            <w:tcW w:w="420" w:type="dxa"/>
             <w:tcBorders>
               <w:top w:val="single" w:sz="6" w:space="0" w:color="000000"/>
               <w:left w:val="single" w:sz="6" w:space="0" w:color="000000"/>
@@ -2877,7 +2982,7 @@
         </w:tc>
         <w:tc>
           <w:tcPr>
-            <w:tcW w:w="0" w:type="auto"/>
+            <w:tcW w:w="420" w:type="dxa"/>
             <w:tcBorders>
               <w:top w:val="single" w:sz="6" w:space="0" w:color="000000"/>
               <w:left w:val="single" w:sz="6" w:space="0" w:color="000000"/>
@@ -2906,7 +3011,7 @@
         </w:tc>
         <w:tc>
           <w:tcPr>
-            <w:tcW w:w="0" w:type="auto"/>
+            <w:tcW w:w="420" w:type="dxa"/>
             <w:tcBorders>
               <w:top w:val="single" w:sz="6" w:space="0" w:color="000000"/>
               <w:left w:val="single" w:sz="6" w:space="0" w:color="000000"/>
@@ -2933,11 +3038,41 @@
             </w:pPr>
           </w:p>
         </w:tc>
+        <w:tc>
+          <w:tcPr>
+            <w:tcW w:w="2766" w:type="dxa"/>
+            <w:tcBorders>
+              <w:top w:val="single" w:sz="6" w:space="0" w:color="000000"/>
+              <w:left w:val="single" w:sz="6" w:space="0" w:color="000000"/>
+              <w:bottom w:val="single" w:sz="6" w:space="0" w:color="000000"/>
+              <w:right w:val="single" w:sz="6" w:space="0" w:color="000000"/>
+            </w:tcBorders>
+            <w:tcMar>
+              <w:top w:w="120" w:type="dxa"/>
+              <w:left w:w="120" w:type="dxa"/>
+              <w:bottom w:w="120" w:type="dxa"/>
+              <w:right w:w="120" w:type="dxa"/>
+            </w:tcMar>
+            <w:hideMark/>
+          </w:tcPr>
+          <w:p>
+            <w:pPr>
+              <w:spacing w:before="200" w:after="200" w:line="240" w:lineRule="auto"/>
+              <w:rPr>
+                <w:rFonts w:ascii="Times New Roman" w:eastAsia="Times New Roman" w:hAnsi="Times New Roman" w:cs="Times New Roman"/>
+                <w:lang w:eastAsia="en-ID"/>
+              </w:rPr>
+            </w:pPr>
+          </w:p>
+        </w:tc>
       </w:tr>
       <w:tr>
-        <w:tc>
-          <w:tcPr>
-            <w:tcW w:w="0" w:type="auto"/>
+        <w:trPr>
+          <w:trHeight w:val="624" w:hRule="atLeast"/>
+        </w:trPr>
+        <w:tc>
+          <w:tcPr>
+            <w:tcW w:w="480" w:type="dxa"/>
             <w:tcBorders>
               <w:top w:val="single" w:sz="6" w:space="0" w:color="000000"/>
               <w:left w:val="single" w:sz="6" w:space="0" w:color="000000"/>
@@ -2972,7 +3107,7 @@
         </w:tc>
         <w:tc>
           <w:tcPr>
-            <w:tcW w:w="0" w:type="auto"/>
+            <w:tcW w:w="4100" w:type="dxa"/>
             <w:tcBorders>
               <w:top w:val="single" w:sz="6" w:space="0" w:color="000000"/>
               <w:left w:val="single" w:sz="6" w:space="0" w:color="000000"/>
@@ -3152,34 +3287,34 @@
         </w:tc>
         <w:tc>
           <w:tcPr>
-            <w:tcW w:w="0" w:type="auto"/>
-            <w:tcBorders>
-              <w:top w:val="single" w:sz="6" w:space="0" w:color="000000"/>
-              <w:left w:val="single" w:sz="6" w:space="0" w:color="000000"/>
-              <w:bottom w:val="single" w:sz="6" w:space="0" w:color="000000"/>
-              <w:right w:val="single" w:sz="6" w:space="0" w:color="000000"/>
-            </w:tcBorders>
-            <w:tcMar>
-              <w:top w:w="120" w:type="dxa"/>
-              <w:left w:w="120" w:type="dxa"/>
-              <w:bottom w:w="120" w:type="dxa"/>
-              <w:right w:w="120" w:type="dxa"/>
-            </w:tcMar>
-            <w:hideMark/>
-          </w:tcPr>
-          <w:p>
-            <w:pPr>
-              <w:spacing w:before="200" w:after="200" w:line="240" w:lineRule="auto"/>
-              <w:rPr>
-                <w:rFonts w:ascii="Times New Roman" w:eastAsia="Times New Roman" w:hAnsi="Times New Roman" w:cs="Times New Roman"/>
-                <w:lang w:eastAsia="en-ID"/>
-              </w:rPr>
-            </w:pPr>
-          </w:p>
-        </w:tc>
-        <w:tc>
-          <w:tcPr>
-            <w:tcW w:w="0" w:type="auto"/>
+            <w:tcW w:w="420" w:type="dxa"/>
+            <w:tcBorders>
+              <w:top w:val="single" w:sz="6" w:space="0" w:color="000000"/>
+              <w:left w:val="single" w:sz="6" w:space="0" w:color="000000"/>
+              <w:bottom w:val="single" w:sz="6" w:space="0" w:color="000000"/>
+              <w:right w:val="single" w:sz="6" w:space="0" w:color="000000"/>
+            </w:tcBorders>
+            <w:tcMar>
+              <w:top w:w="120" w:type="dxa"/>
+              <w:left w:w="120" w:type="dxa"/>
+              <w:bottom w:w="120" w:type="dxa"/>
+              <w:right w:w="120" w:type="dxa"/>
+            </w:tcMar>
+            <w:hideMark/>
+          </w:tcPr>
+          <w:p>
+            <w:pPr>
+              <w:spacing w:before="200" w:after="200" w:line="240" w:lineRule="auto"/>
+              <w:rPr>
+                <w:rFonts w:ascii="Times New Roman" w:eastAsia="Times New Roman" w:hAnsi="Times New Roman" w:cs="Times New Roman"/>
+                <w:lang w:eastAsia="en-ID"/>
+              </w:rPr>
+            </w:pPr>
+          </w:p>
+        </w:tc>
+        <w:tc>
+          <w:tcPr>
+            <w:tcW w:w="420" w:type="dxa"/>
             <w:tcBorders>
               <w:top w:val="single" w:sz="6" w:space="0" w:color="000000"/>
               <w:left w:val="single" w:sz="6" w:space="0" w:color="000000"/>
@@ -3208,7 +3343,7 @@
         </w:tc>
         <w:tc>
           <w:tcPr>
-            <w:tcW w:w="0" w:type="auto"/>
+            <w:tcW w:w="420" w:type="dxa"/>
             <w:tcBorders>
               <w:top w:val="single" w:sz="6" w:space="0" w:color="000000"/>
               <w:left w:val="single" w:sz="6" w:space="0" w:color="000000"/>
@@ -3237,7 +3372,7 @@
         </w:tc>
         <w:tc>
           <w:tcPr>
-            <w:tcW w:w="0" w:type="auto"/>
+            <w:tcW w:w="420" w:type="dxa"/>
             <w:tcBorders>
               <w:top w:val="single" w:sz="6" w:space="0" w:color="000000"/>
               <w:left w:val="single" w:sz="6" w:space="0" w:color="000000"/>
@@ -3264,11 +3399,41 @@
             </w:pPr>
           </w:p>
         </w:tc>
+        <w:tc>
+          <w:tcPr>
+            <w:tcW w:w="2766" w:type="dxa"/>
+            <w:tcBorders>
+              <w:top w:val="single" w:sz="6" w:space="0" w:color="000000"/>
+              <w:left w:val="single" w:sz="6" w:space="0" w:color="000000"/>
+              <w:bottom w:val="single" w:sz="6" w:space="0" w:color="000000"/>
+              <w:right w:val="single" w:sz="6" w:space="0" w:color="000000"/>
+            </w:tcBorders>
+            <w:tcMar>
+              <w:top w:w="120" w:type="dxa"/>
+              <w:left w:w="120" w:type="dxa"/>
+              <w:bottom w:w="120" w:type="dxa"/>
+              <w:right w:w="120" w:type="dxa"/>
+            </w:tcMar>
+            <w:hideMark/>
+          </w:tcPr>
+          <w:p>
+            <w:pPr>
+              <w:spacing w:before="200" w:after="200" w:line="240" w:lineRule="auto"/>
+              <w:rPr>
+                <w:rFonts w:ascii="Times New Roman" w:eastAsia="Times New Roman" w:hAnsi="Times New Roman" w:cs="Times New Roman"/>
+                <w:lang w:eastAsia="en-ID"/>
+              </w:rPr>
+            </w:pPr>
+          </w:p>
+        </w:tc>
       </w:tr>
       <w:tr>
-        <w:tc>
-          <w:tcPr>
-            <w:tcW w:w="0" w:type="auto"/>
+        <w:trPr>
+          <w:trHeight w:val="624" w:hRule="atLeast"/>
+        </w:trPr>
+        <w:tc>
+          <w:tcPr>
+            <w:tcW w:w="480" w:type="dxa"/>
             <w:tcBorders>
               <w:top w:val="single" w:sz="6" w:space="0" w:color="000000"/>
               <w:left w:val="single" w:sz="6" w:space="0" w:color="000000"/>
@@ -3303,7 +3468,7 @@
         </w:tc>
         <w:tc>
           <w:tcPr>
-            <w:tcW w:w="0" w:type="auto"/>
+            <w:tcW w:w="4100" w:type="dxa"/>
             <w:tcBorders>
               <w:top w:val="single" w:sz="6" w:space="0" w:color="000000"/>
               <w:left w:val="single" w:sz="6" w:space="0" w:color="000000"/>
@@ -3483,34 +3648,34 @@
         </w:tc>
         <w:tc>
           <w:tcPr>
-            <w:tcW w:w="0" w:type="auto"/>
-            <w:tcBorders>
-              <w:top w:val="single" w:sz="6" w:space="0" w:color="000000"/>
-              <w:left w:val="single" w:sz="6" w:space="0" w:color="000000"/>
-              <w:bottom w:val="single" w:sz="6" w:space="0" w:color="000000"/>
-              <w:right w:val="single" w:sz="6" w:space="0" w:color="000000"/>
-            </w:tcBorders>
-            <w:tcMar>
-              <w:top w:w="120" w:type="dxa"/>
-              <w:left w:w="120" w:type="dxa"/>
-              <w:bottom w:w="120" w:type="dxa"/>
-              <w:right w:w="120" w:type="dxa"/>
-            </w:tcMar>
-            <w:hideMark/>
-          </w:tcPr>
-          <w:p>
-            <w:pPr>
-              <w:spacing w:before="200" w:after="200" w:line="240" w:lineRule="auto"/>
-              <w:rPr>
-                <w:rFonts w:ascii="Times New Roman" w:eastAsia="Times New Roman" w:hAnsi="Times New Roman" w:cs="Times New Roman"/>
-                <w:lang w:eastAsia="en-ID"/>
-              </w:rPr>
-            </w:pPr>
-          </w:p>
-        </w:tc>
-        <w:tc>
-          <w:tcPr>
-            <w:tcW w:w="0" w:type="auto"/>
+            <w:tcW w:w="420" w:type="dxa"/>
+            <w:tcBorders>
+              <w:top w:val="single" w:sz="6" w:space="0" w:color="000000"/>
+              <w:left w:val="single" w:sz="6" w:space="0" w:color="000000"/>
+              <w:bottom w:val="single" w:sz="6" w:space="0" w:color="000000"/>
+              <w:right w:val="single" w:sz="6" w:space="0" w:color="000000"/>
+            </w:tcBorders>
+            <w:tcMar>
+              <w:top w:w="120" w:type="dxa"/>
+              <w:left w:w="120" w:type="dxa"/>
+              <w:bottom w:w="120" w:type="dxa"/>
+              <w:right w:w="120" w:type="dxa"/>
+            </w:tcMar>
+            <w:hideMark/>
+          </w:tcPr>
+          <w:p>
+            <w:pPr>
+              <w:spacing w:before="200" w:after="200" w:line="240" w:lineRule="auto"/>
+              <w:rPr>
+                <w:rFonts w:ascii="Times New Roman" w:eastAsia="Times New Roman" w:hAnsi="Times New Roman" w:cs="Times New Roman"/>
+                <w:lang w:eastAsia="en-ID"/>
+              </w:rPr>
+            </w:pPr>
+          </w:p>
+        </w:tc>
+        <w:tc>
+          <w:tcPr>
+            <w:tcW w:w="420" w:type="dxa"/>
             <w:tcBorders>
               <w:top w:val="single" w:sz="6" w:space="0" w:color="000000"/>
               <w:left w:val="single" w:sz="6" w:space="0" w:color="000000"/>
@@ -3539,7 +3704,7 @@
         </w:tc>
         <w:tc>
           <w:tcPr>
-            <w:tcW w:w="0" w:type="auto"/>
+            <w:tcW w:w="420" w:type="dxa"/>
             <w:tcBorders>
               <w:top w:val="single" w:sz="6" w:space="0" w:color="000000"/>
               <w:left w:val="single" w:sz="6" w:space="0" w:color="000000"/>
@@ -3568,7 +3733,7 @@
         </w:tc>
         <w:tc>
           <w:tcPr>
-            <w:tcW w:w="0" w:type="auto"/>
+            <w:tcW w:w="420" w:type="dxa"/>
             <w:tcBorders>
               <w:top w:val="single" w:sz="6" w:space="0" w:color="000000"/>
               <w:left w:val="single" w:sz="6" w:space="0" w:color="000000"/>
@@ -3595,11 +3760,41 @@
             </w:pPr>
           </w:p>
         </w:tc>
+        <w:tc>
+          <w:tcPr>
+            <w:tcW w:w="2766" w:type="dxa"/>
+            <w:tcBorders>
+              <w:top w:val="single" w:sz="6" w:space="0" w:color="000000"/>
+              <w:left w:val="single" w:sz="6" w:space="0" w:color="000000"/>
+              <w:bottom w:val="single" w:sz="6" w:space="0" w:color="000000"/>
+              <w:right w:val="single" w:sz="6" w:space="0" w:color="000000"/>
+            </w:tcBorders>
+            <w:tcMar>
+              <w:top w:w="120" w:type="dxa"/>
+              <w:left w:w="120" w:type="dxa"/>
+              <w:bottom w:w="120" w:type="dxa"/>
+              <w:right w:w="120" w:type="dxa"/>
+            </w:tcMar>
+            <w:hideMark/>
+          </w:tcPr>
+          <w:p>
+            <w:pPr>
+              <w:spacing w:before="200" w:after="200" w:line="240" w:lineRule="auto"/>
+              <w:rPr>
+                <w:rFonts w:ascii="Times New Roman" w:eastAsia="Times New Roman" w:hAnsi="Times New Roman" w:cs="Times New Roman"/>
+                <w:lang w:eastAsia="en-ID"/>
+              </w:rPr>
+            </w:pPr>
+          </w:p>
+        </w:tc>
       </w:tr>
       <w:tr>
-        <w:tc>
-          <w:tcPr>
-            <w:tcW w:w="0" w:type="auto"/>
+        <w:trPr>
+          <w:trHeight w:val="624" w:hRule="atLeast"/>
+        </w:trPr>
+        <w:tc>
+          <w:tcPr>
+            <w:tcW w:w="480" w:type="dxa"/>
             <w:tcBorders>
               <w:top w:val="single" w:sz="6" w:space="0" w:color="000000"/>
               <w:left w:val="single" w:sz="6" w:space="0" w:color="000000"/>
@@ -3634,7 +3829,7 @@
         </w:tc>
         <w:tc>
           <w:tcPr>
-            <w:tcW w:w="0" w:type="auto"/>
+            <w:tcW w:w="4100" w:type="dxa"/>
             <w:tcBorders>
               <w:top w:val="single" w:sz="6" w:space="0" w:color="000000"/>
               <w:left w:val="single" w:sz="6" w:space="0" w:color="000000"/>
@@ -3862,34 +4057,34 @@
         </w:tc>
         <w:tc>
           <w:tcPr>
-            <w:tcW w:w="0" w:type="auto"/>
-            <w:tcBorders>
-              <w:top w:val="single" w:sz="6" w:space="0" w:color="000000"/>
-              <w:left w:val="single" w:sz="6" w:space="0" w:color="000000"/>
-              <w:bottom w:val="single" w:sz="6" w:space="0" w:color="000000"/>
-              <w:right w:val="single" w:sz="6" w:space="0" w:color="000000"/>
-            </w:tcBorders>
-            <w:tcMar>
-              <w:top w:w="120" w:type="dxa"/>
-              <w:left w:w="120" w:type="dxa"/>
-              <w:bottom w:w="120" w:type="dxa"/>
-              <w:right w:w="120" w:type="dxa"/>
-            </w:tcMar>
-            <w:hideMark/>
-          </w:tcPr>
-          <w:p>
-            <w:pPr>
-              <w:spacing w:before="200" w:after="200" w:line="240" w:lineRule="auto"/>
-              <w:rPr>
-                <w:rFonts w:ascii="Times New Roman" w:eastAsia="Times New Roman" w:hAnsi="Times New Roman" w:cs="Times New Roman"/>
-                <w:lang w:eastAsia="en-ID"/>
-              </w:rPr>
-            </w:pPr>
-          </w:p>
-        </w:tc>
-        <w:tc>
-          <w:tcPr>
-            <w:tcW w:w="0" w:type="auto"/>
+            <w:tcW w:w="420" w:type="dxa"/>
+            <w:tcBorders>
+              <w:top w:val="single" w:sz="6" w:space="0" w:color="000000"/>
+              <w:left w:val="single" w:sz="6" w:space="0" w:color="000000"/>
+              <w:bottom w:val="single" w:sz="6" w:space="0" w:color="000000"/>
+              <w:right w:val="single" w:sz="6" w:space="0" w:color="000000"/>
+            </w:tcBorders>
+            <w:tcMar>
+              <w:top w:w="120" w:type="dxa"/>
+              <w:left w:w="120" w:type="dxa"/>
+              <w:bottom w:w="120" w:type="dxa"/>
+              <w:right w:w="120" w:type="dxa"/>
+            </w:tcMar>
+            <w:hideMark/>
+          </w:tcPr>
+          <w:p>
+            <w:pPr>
+              <w:spacing w:before="200" w:after="200" w:line="240" w:lineRule="auto"/>
+              <w:rPr>
+                <w:rFonts w:ascii="Times New Roman" w:eastAsia="Times New Roman" w:hAnsi="Times New Roman" w:cs="Times New Roman"/>
+                <w:lang w:eastAsia="en-ID"/>
+              </w:rPr>
+            </w:pPr>
+          </w:p>
+        </w:tc>
+        <w:tc>
+          <w:tcPr>
+            <w:tcW w:w="420" w:type="dxa"/>
             <w:tcBorders>
               <w:top w:val="single" w:sz="6" w:space="0" w:color="000000"/>
               <w:left w:val="single" w:sz="6" w:space="0" w:color="000000"/>
@@ -3918,7 +4113,7 @@
         </w:tc>
         <w:tc>
           <w:tcPr>
-            <w:tcW w:w="0" w:type="auto"/>
+            <w:tcW w:w="420" w:type="dxa"/>
             <w:tcBorders>
               <w:top w:val="single" w:sz="6" w:space="0" w:color="000000"/>
               <w:left w:val="single" w:sz="6" w:space="0" w:color="000000"/>
@@ -3947,7 +4142,7 @@
         </w:tc>
         <w:tc>
           <w:tcPr>
-            <w:tcW w:w="0" w:type="auto"/>
+            <w:tcW w:w="420" w:type="dxa"/>
             <w:tcBorders>
               <w:top w:val="single" w:sz="6" w:space="0" w:color="000000"/>
               <w:left w:val="single" w:sz="6" w:space="0" w:color="000000"/>
@@ -3969,6 +4164,33 @@
                 <w:rFonts w:ascii="Times New Roman" w:eastAsia="Times New Roman" w:hAnsi="Times New Roman" w:cs="Times New Roman"/>
                 <w:sz w:val="20"/>
                 <w:szCs w:val="20"/>
+                <w:lang w:eastAsia="en-ID"/>
+              </w:rPr>
+            </w:pPr>
+          </w:p>
+        </w:tc>
+        <w:tc>
+          <w:tcPr>
+            <w:tcW w:w="2766" w:type="dxa"/>
+            <w:tcBorders>
+              <w:top w:val="single" w:sz="6" w:space="0" w:color="000000"/>
+              <w:left w:val="single" w:sz="6" w:space="0" w:color="000000"/>
+              <w:bottom w:val="single" w:sz="6" w:space="0" w:color="000000"/>
+              <w:right w:val="single" w:sz="6" w:space="0" w:color="000000"/>
+            </w:tcBorders>
+            <w:tcMar>
+              <w:top w:w="120" w:type="dxa"/>
+              <w:left w:w="120" w:type="dxa"/>
+              <w:bottom w:w="120" w:type="dxa"/>
+              <w:right w:w="120" w:type="dxa"/>
+            </w:tcMar>
+            <w:hideMark/>
+          </w:tcPr>
+          <w:p>
+            <w:pPr>
+              <w:spacing w:before="200" w:after="200" w:line="240" w:lineRule="auto"/>
+              <w:rPr>
+                <w:rFonts w:ascii="Times New Roman" w:eastAsia="Times New Roman" w:hAnsi="Times New Roman" w:cs="Times New Roman"/>
                 <w:lang w:eastAsia="en-ID"/>
               </w:rPr>
             </w:pPr>
@@ -4278,7 +4500,7 @@
     </w:p>
     <w:tbl>
       <w:tblPr>
-        <w:tblW w:w="4605" w:type="pct"/>
+        <w:tblW w:w="9026" w:type="dxa"/>
         <w:tblBorders>
           <w:top w:val="single" w:sz="6" w:space="0" w:color="000000"/>
           <w:left w:val="single" w:sz="6" w:space="0" w:color="000000"/>
@@ -4294,17 +4516,18 @@
         <w:tblLook w:val="04A0" w:firstRow="1" w:lastRow="0" w:firstColumn="1" w:lastColumn="0" w:noHBand="0" w:noVBand="1"/>
       </w:tblPr>
       <w:tblGrid>
-        <w:gridCol w:w="510"/>
-        <w:gridCol w:w="4948"/>
-        <w:gridCol w:w="710"/>
-        <w:gridCol w:w="710"/>
-        <w:gridCol w:w="710"/>
-        <w:gridCol w:w="710"/>
+        <w:gridCol w:w="480"/>
+        <w:gridCol w:w="4100"/>
+        <w:gridCol w:w="420"/>
+        <w:gridCol w:w="420"/>
+        <w:gridCol w:w="420"/>
+        <w:gridCol w:w="420"/>
+        <w:gridCol w:w="2766"/>
       </w:tblGrid>
       <w:tr>
         <w:tc>
           <w:tcPr>
-            <w:tcW w:w="307" w:type="pct"/>
+            <w:tcW w:w="480" w:type="dxa"/>
             <w:tcBorders>
               <w:top w:val="single" w:sz="6" w:space="0" w:color="000000"/>
               <w:left w:val="single" w:sz="6" w:space="0" w:color="000000"/>
@@ -4345,7 +4568,7 @@
         </w:tc>
         <w:tc>
           <w:tcPr>
-            <w:tcW w:w="2980" w:type="pct"/>
+            <w:tcW w:w="4100" w:type="dxa"/>
             <w:tcBorders>
               <w:top w:val="single" w:sz="6" w:space="0" w:color="000000"/>
               <w:left w:val="single" w:sz="6" w:space="0" w:color="000000"/>
@@ -4388,7 +4611,7 @@
         </w:tc>
         <w:tc>
           <w:tcPr>
-            <w:tcW w:w="428" w:type="pct"/>
+            <w:tcW w:w="420" w:type="dxa"/>
             <w:tcBorders>
               <w:top w:val="single" w:sz="6" w:space="0" w:color="000000"/>
               <w:left w:val="single" w:sz="6" w:space="0" w:color="000000"/>
@@ -4429,7 +4652,7 @@
         </w:tc>
         <w:tc>
           <w:tcPr>
-            <w:tcW w:w="428" w:type="pct"/>
+            <w:tcW w:w="420" w:type="dxa"/>
             <w:tcBorders>
               <w:top w:val="single" w:sz="6" w:space="0" w:color="000000"/>
               <w:left w:val="single" w:sz="6" w:space="0" w:color="000000"/>
@@ -4470,7 +4693,7 @@
         </w:tc>
         <w:tc>
           <w:tcPr>
-            <w:tcW w:w="428" w:type="pct"/>
+            <w:tcW w:w="420" w:type="dxa"/>
             <w:tcBorders>
               <w:top w:val="single" w:sz="6" w:space="0" w:color="000000"/>
               <w:left w:val="single" w:sz="6" w:space="0" w:color="000000"/>
@@ -4511,7 +4734,7 @@
         </w:tc>
         <w:tc>
           <w:tcPr>
-            <w:tcW w:w="428" w:type="pct"/>
+            <w:tcW w:w="420" w:type="dxa"/>
             <w:tcBorders>
               <w:top w:val="single" w:sz="6" w:space="0" w:color="000000"/>
               <w:left w:val="single" w:sz="6" w:space="0" w:color="000000"/>
@@ -4550,11 +4773,55 @@
             </w:r>
           </w:p>
         </w:tc>
+        <w:tc>
+          <w:tcPr>
+            <w:tcW w:w="2766" w:type="dxa"/>
+            <w:tcBorders>
+              <w:top w:val="single" w:sz="6" w:space="0" w:color="000000"/>
+              <w:left w:val="single" w:sz="6" w:space="0" w:color="000000"/>
+              <w:bottom w:val="single" w:sz="6" w:space="0" w:color="000000"/>
+              <w:right w:val="single" w:sz="6" w:space="0" w:color="000000"/>
+            </w:tcBorders>
+            <w:shd w:val="clear" w:color="auto" w:fill="F0F0F0"/>
+            <w:tcMar>
+              <w:top w:w="120" w:type="dxa"/>
+              <w:left w:w="120" w:type="dxa"/>
+              <w:bottom w:w="120" w:type="dxa"/>
+              <w:right w:w="120" w:type="dxa"/>
+            </w:tcMar>
+            <w:vAlign w:val="center"/>
+            <w:hideMark/>
+          </w:tcPr>
+          <w:p>
+            <w:pPr>
+              <w:spacing w:before="200" w:after="200" w:line="240" w:lineRule="auto"/>
+              <w:jc w:val="center"/>
+              <w:rPr>
+                <w:rFonts w:ascii="Times New Roman" w:eastAsia="Times New Roman" w:hAnsi="Times New Roman" w:cs="Times New Roman"/>
+                <w:b/>
+                <w:bCs/>
+                <w:lang w:eastAsia="en-ID"/>
+              </w:rPr>
+            </w:pPr>
+            <w:r>
+              <w:rPr>
+                <w:rFonts w:ascii="Times New Roman" w:eastAsia="Times New Roman" w:hAnsi="Times New Roman" w:cs="Times New Roman"/>
+                <w:b/>
+                <w:bCs/>
+                <w:lang w:eastAsia="en-ID"/>
+              </w:rPr>
+              <w:t>Catatan</w:t>
+            </w:r>
+          </w:p>
+        </w:tc>
       </w:tr>
       <w:tr>
-        <w:tc>
-          <w:tcPr>
-            <w:tcW w:w="0" w:type="auto"/>
+        <w:trPr>
+          <w:trHeight w:val="624" w:hRule="atLeast"/>
+        </w:trPr>
+        <w:tc>
+          <w:tcPr>
+            <w:tcW w:w="480" w:type="dxa"/>
             <w:tcBorders>
               <w:top w:val="single" w:sz="6" w:space="0" w:color="000000"/>
               <w:left w:val="single" w:sz="6" w:space="0" w:color="000000"/>
@@ -4589,7 +4856,7 @@
         </w:tc>
         <w:tc>
           <w:tcPr>
-            <w:tcW w:w="0" w:type="auto"/>
+            <w:tcW w:w="4100" w:type="dxa"/>
             <w:tcBorders>
               <w:top w:val="single" w:sz="6" w:space="0" w:color="000000"/>
               <w:left w:val="single" w:sz="6" w:space="0" w:color="000000"/>
@@ -4721,34 +4988,34 @@
         </w:tc>
         <w:tc>
           <w:tcPr>
-            <w:tcW w:w="0" w:type="auto"/>
-            <w:tcBorders>
-              <w:top w:val="single" w:sz="6" w:space="0" w:color="000000"/>
-              <w:left w:val="single" w:sz="6" w:space="0" w:color="000000"/>
-              <w:bottom w:val="single" w:sz="6" w:space="0" w:color="000000"/>
-              <w:right w:val="single" w:sz="6" w:space="0" w:color="000000"/>
-            </w:tcBorders>
-            <w:tcMar>
-              <w:top w:w="120" w:type="dxa"/>
-              <w:left w:w="120" w:type="dxa"/>
-              <w:bottom w:w="120" w:type="dxa"/>
-              <w:right w:w="120" w:type="dxa"/>
-            </w:tcMar>
-            <w:hideMark/>
-          </w:tcPr>
-          <w:p>
-            <w:pPr>
-              <w:spacing w:before="200" w:after="200" w:line="240" w:lineRule="auto"/>
-              <w:rPr>
-                <w:rFonts w:ascii="Times New Roman" w:eastAsia="Times New Roman" w:hAnsi="Times New Roman" w:cs="Times New Roman"/>
-                <w:lang w:eastAsia="en-ID"/>
-              </w:rPr>
-            </w:pPr>
-          </w:p>
-        </w:tc>
-        <w:tc>
-          <w:tcPr>
-            <w:tcW w:w="0" w:type="auto"/>
+            <w:tcW w:w="420" w:type="dxa"/>
+            <w:tcBorders>
+              <w:top w:val="single" w:sz="6" w:space="0" w:color="000000"/>
+              <w:left w:val="single" w:sz="6" w:space="0" w:color="000000"/>
+              <w:bottom w:val="single" w:sz="6" w:space="0" w:color="000000"/>
+              <w:right w:val="single" w:sz="6" w:space="0" w:color="000000"/>
+            </w:tcBorders>
+            <w:tcMar>
+              <w:top w:w="120" w:type="dxa"/>
+              <w:left w:w="120" w:type="dxa"/>
+              <w:bottom w:w="120" w:type="dxa"/>
+              <w:right w:w="120" w:type="dxa"/>
+            </w:tcMar>
+            <w:hideMark/>
+          </w:tcPr>
+          <w:p>
+            <w:pPr>
+              <w:spacing w:before="200" w:after="200" w:line="240" w:lineRule="auto"/>
+              <w:rPr>
+                <w:rFonts w:ascii="Times New Roman" w:eastAsia="Times New Roman" w:hAnsi="Times New Roman" w:cs="Times New Roman"/>
+                <w:lang w:eastAsia="en-ID"/>
+              </w:rPr>
+            </w:pPr>
+          </w:p>
+        </w:tc>
+        <w:tc>
+          <w:tcPr>
+            <w:tcW w:w="420" w:type="dxa"/>
             <w:tcBorders>
               <w:top w:val="single" w:sz="6" w:space="0" w:color="000000"/>
               <w:left w:val="single" w:sz="6" w:space="0" w:color="000000"/>
@@ -4777,7 +5044,7 @@
         </w:tc>
         <w:tc>
           <w:tcPr>
-            <w:tcW w:w="0" w:type="auto"/>
+            <w:tcW w:w="420" w:type="dxa"/>
             <w:tcBorders>
               <w:top w:val="single" w:sz="6" w:space="0" w:color="000000"/>
               <w:left w:val="single" w:sz="6" w:space="0" w:color="000000"/>
@@ -4806,7 +5073,7 @@
         </w:tc>
         <w:tc>
           <w:tcPr>
-            <w:tcW w:w="0" w:type="auto"/>
+            <w:tcW w:w="420" w:type="dxa"/>
             <w:tcBorders>
               <w:top w:val="single" w:sz="6" w:space="0" w:color="000000"/>
               <w:left w:val="single" w:sz="6" w:space="0" w:color="000000"/>
@@ -4833,11 +5100,41 @@
             </w:pPr>
           </w:p>
         </w:tc>
+        <w:tc>
+          <w:tcPr>
+            <w:tcW w:w="2766" w:type="dxa"/>
+            <w:tcBorders>
+              <w:top w:val="single" w:sz="6" w:space="0" w:color="000000"/>
+              <w:left w:val="single" w:sz="6" w:space="0" w:color="000000"/>
+              <w:bottom w:val="single" w:sz="6" w:space="0" w:color="000000"/>
+              <w:right w:val="single" w:sz="6" w:space="0" w:color="000000"/>
+            </w:tcBorders>
+            <w:tcMar>
+              <w:top w:w="120" w:type="dxa"/>
+              <w:left w:w="120" w:type="dxa"/>
+              <w:bottom w:w="120" w:type="dxa"/>
+              <w:right w:w="120" w:type="dxa"/>
+            </w:tcMar>
+            <w:hideMark/>
+          </w:tcPr>
+          <w:p>
+            <w:pPr>
+              <w:spacing w:before="200" w:after="200" w:line="240" w:lineRule="auto"/>
+              <w:rPr>
+                <w:rFonts w:ascii="Times New Roman" w:eastAsia="Times New Roman" w:hAnsi="Times New Roman" w:cs="Times New Roman"/>
+                <w:lang w:eastAsia="en-ID"/>
+              </w:rPr>
+            </w:pPr>
+          </w:p>
+        </w:tc>
       </w:tr>
       <w:tr>
-        <w:tc>
-          <w:tcPr>
-            <w:tcW w:w="0" w:type="auto"/>
+        <w:trPr>
+          <w:trHeight w:val="624" w:hRule="atLeast"/>
+        </w:trPr>
+        <w:tc>
+          <w:tcPr>
+            <w:tcW w:w="480" w:type="dxa"/>
             <w:tcBorders>
               <w:top w:val="single" w:sz="6" w:space="0" w:color="000000"/>
               <w:left w:val="single" w:sz="6" w:space="0" w:color="000000"/>
@@ -4872,7 +5169,7 @@
         </w:tc>
         <w:tc>
           <w:tcPr>
-            <w:tcW w:w="0" w:type="auto"/>
+            <w:tcW w:w="4100" w:type="dxa"/>
             <w:tcBorders>
               <w:top w:val="single" w:sz="6" w:space="0" w:color="000000"/>
               <w:left w:val="single" w:sz="6" w:space="0" w:color="000000"/>
@@ -5116,34 +5413,34 @@
         </w:tc>
         <w:tc>
           <w:tcPr>
-            <w:tcW w:w="0" w:type="auto"/>
-            <w:tcBorders>
-              <w:top w:val="single" w:sz="6" w:space="0" w:color="000000"/>
-              <w:left w:val="single" w:sz="6" w:space="0" w:color="000000"/>
-              <w:bottom w:val="single" w:sz="6" w:space="0" w:color="000000"/>
-              <w:right w:val="single" w:sz="6" w:space="0" w:color="000000"/>
-            </w:tcBorders>
-            <w:tcMar>
-              <w:top w:w="120" w:type="dxa"/>
-              <w:left w:w="120" w:type="dxa"/>
-              <w:bottom w:w="120" w:type="dxa"/>
-              <w:right w:w="120" w:type="dxa"/>
-            </w:tcMar>
-            <w:hideMark/>
-          </w:tcPr>
-          <w:p>
-            <w:pPr>
-              <w:spacing w:before="200" w:after="200" w:line="240" w:lineRule="auto"/>
-              <w:rPr>
-                <w:rFonts w:ascii="Times New Roman" w:eastAsia="Times New Roman" w:hAnsi="Times New Roman" w:cs="Times New Roman"/>
-                <w:lang w:eastAsia="en-ID"/>
-              </w:rPr>
-            </w:pPr>
-          </w:p>
-        </w:tc>
-        <w:tc>
-          <w:tcPr>
-            <w:tcW w:w="0" w:type="auto"/>
+            <w:tcW w:w="420" w:type="dxa"/>
+            <w:tcBorders>
+              <w:top w:val="single" w:sz="6" w:space="0" w:color="000000"/>
+              <w:left w:val="single" w:sz="6" w:space="0" w:color="000000"/>
+              <w:bottom w:val="single" w:sz="6" w:space="0" w:color="000000"/>
+              <w:right w:val="single" w:sz="6" w:space="0" w:color="000000"/>
+            </w:tcBorders>
+            <w:tcMar>
+              <w:top w:w="120" w:type="dxa"/>
+              <w:left w:w="120" w:type="dxa"/>
+              <w:bottom w:w="120" w:type="dxa"/>
+              <w:right w:w="120" w:type="dxa"/>
+            </w:tcMar>
+            <w:hideMark/>
+          </w:tcPr>
+          <w:p>
+            <w:pPr>
+              <w:spacing w:before="200" w:after="200" w:line="240" w:lineRule="auto"/>
+              <w:rPr>
+                <w:rFonts w:ascii="Times New Roman" w:eastAsia="Times New Roman" w:hAnsi="Times New Roman" w:cs="Times New Roman"/>
+                <w:lang w:eastAsia="en-ID"/>
+              </w:rPr>
+            </w:pPr>
+          </w:p>
+        </w:tc>
+        <w:tc>
+          <w:tcPr>
+            <w:tcW w:w="420" w:type="dxa"/>
             <w:tcBorders>
               <w:top w:val="single" w:sz="6" w:space="0" w:color="000000"/>
               <w:left w:val="single" w:sz="6" w:space="0" w:color="000000"/>
@@ -5172,7 +5469,7 @@
         </w:tc>
         <w:tc>
           <w:tcPr>
-            <w:tcW w:w="0" w:type="auto"/>
+            <w:tcW w:w="420" w:type="dxa"/>
             <w:tcBorders>
               <w:top w:val="single" w:sz="6" w:space="0" w:color="000000"/>
               <w:left w:val="single" w:sz="6" w:space="0" w:color="000000"/>
@@ -5201,7 +5498,7 @@
         </w:tc>
         <w:tc>
           <w:tcPr>
-            <w:tcW w:w="0" w:type="auto"/>
+            <w:tcW w:w="420" w:type="dxa"/>
             <w:tcBorders>
               <w:top w:val="single" w:sz="6" w:space="0" w:color="000000"/>
               <w:left w:val="single" w:sz="6" w:space="0" w:color="000000"/>
@@ -5228,11 +5525,41 @@
             </w:pPr>
           </w:p>
         </w:tc>
+        <w:tc>
+          <w:tcPr>
+            <w:tcW w:w="2766" w:type="dxa"/>
+            <w:tcBorders>
+              <w:top w:val="single" w:sz="6" w:space="0" w:color="000000"/>
+              <w:left w:val="single" w:sz="6" w:space="0" w:color="000000"/>
+              <w:bottom w:val="single" w:sz="6" w:space="0" w:color="000000"/>
+              <w:right w:val="single" w:sz="6" w:space="0" w:color="000000"/>
+            </w:tcBorders>
+            <w:tcMar>
+              <w:top w:w="120" w:type="dxa"/>
+              <w:left w:w="120" w:type="dxa"/>
+              <w:bottom w:w="120" w:type="dxa"/>
+              <w:right w:w="120" w:type="dxa"/>
+            </w:tcMar>
+            <w:hideMark/>
+          </w:tcPr>
+          <w:p>
+            <w:pPr>
+              <w:spacing w:before="200" w:after="200" w:line="240" w:lineRule="auto"/>
+              <w:rPr>
+                <w:rFonts w:ascii="Times New Roman" w:eastAsia="Times New Roman" w:hAnsi="Times New Roman" w:cs="Times New Roman"/>
+                <w:lang w:eastAsia="en-ID"/>
+              </w:rPr>
+            </w:pPr>
+          </w:p>
+        </w:tc>
       </w:tr>
       <w:tr>
-        <w:tc>
-          <w:tcPr>
-            <w:tcW w:w="0" w:type="auto"/>
+        <w:trPr>
+          <w:trHeight w:val="624" w:hRule="atLeast"/>
+        </w:trPr>
+        <w:tc>
+          <w:tcPr>
+            <w:tcW w:w="480" w:type="dxa"/>
             <w:tcBorders>
               <w:top w:val="single" w:sz="6" w:space="0" w:color="000000"/>
               <w:left w:val="single" w:sz="6" w:space="0" w:color="000000"/>
@@ -5267,7 +5594,7 @@
         </w:tc>
         <w:tc>
           <w:tcPr>
-            <w:tcW w:w="0" w:type="auto"/>
+            <w:tcW w:w="4100" w:type="dxa"/>
             <w:tcBorders>
               <w:top w:val="single" w:sz="6" w:space="0" w:color="000000"/>
               <w:left w:val="single" w:sz="6" w:space="0" w:color="000000"/>
@@ -5511,34 +5838,34 @@
         </w:tc>
         <w:tc>
           <w:tcPr>
-            <w:tcW w:w="0" w:type="auto"/>
-            <w:tcBorders>
-              <w:top w:val="single" w:sz="6" w:space="0" w:color="000000"/>
-              <w:left w:val="single" w:sz="6" w:space="0" w:color="000000"/>
-              <w:bottom w:val="single" w:sz="6" w:space="0" w:color="000000"/>
-              <w:right w:val="single" w:sz="6" w:space="0" w:color="000000"/>
-            </w:tcBorders>
-            <w:tcMar>
-              <w:top w:w="120" w:type="dxa"/>
-              <w:left w:w="120" w:type="dxa"/>
-              <w:bottom w:w="120" w:type="dxa"/>
-              <w:right w:w="120" w:type="dxa"/>
-            </w:tcMar>
-            <w:hideMark/>
-          </w:tcPr>
-          <w:p>
-            <w:pPr>
-              <w:spacing w:before="200" w:after="200" w:line="240" w:lineRule="auto"/>
-              <w:rPr>
-                <w:rFonts w:ascii="Times New Roman" w:eastAsia="Times New Roman" w:hAnsi="Times New Roman" w:cs="Times New Roman"/>
-                <w:lang w:eastAsia="en-ID"/>
-              </w:rPr>
-            </w:pPr>
-          </w:p>
-        </w:tc>
-        <w:tc>
-          <w:tcPr>
-            <w:tcW w:w="0" w:type="auto"/>
+            <w:tcW w:w="420" w:type="dxa"/>
+            <w:tcBorders>
+              <w:top w:val="single" w:sz="6" w:space="0" w:color="000000"/>
+              <w:left w:val="single" w:sz="6" w:space="0" w:color="000000"/>
+              <w:bottom w:val="single" w:sz="6" w:space="0" w:color="000000"/>
+              <w:right w:val="single" w:sz="6" w:space="0" w:color="000000"/>
+            </w:tcBorders>
+            <w:tcMar>
+              <w:top w:w="120" w:type="dxa"/>
+              <w:left w:w="120" w:type="dxa"/>
+              <w:bottom w:w="120" w:type="dxa"/>
+              <w:right w:w="120" w:type="dxa"/>
+            </w:tcMar>
+            <w:hideMark/>
+          </w:tcPr>
+          <w:p>
+            <w:pPr>
+              <w:spacing w:before="200" w:after="200" w:line="240" w:lineRule="auto"/>
+              <w:rPr>
+                <w:rFonts w:ascii="Times New Roman" w:eastAsia="Times New Roman" w:hAnsi="Times New Roman" w:cs="Times New Roman"/>
+                <w:lang w:eastAsia="en-ID"/>
+              </w:rPr>
+            </w:pPr>
+          </w:p>
+        </w:tc>
+        <w:tc>
+          <w:tcPr>
+            <w:tcW w:w="420" w:type="dxa"/>
             <w:tcBorders>
               <w:top w:val="single" w:sz="6" w:space="0" w:color="000000"/>
               <w:left w:val="single" w:sz="6" w:space="0" w:color="000000"/>
@@ -5567,7 +5894,7 @@
         </w:tc>
         <w:tc>
           <w:tcPr>
-            <w:tcW w:w="0" w:type="auto"/>
+            <w:tcW w:w="420" w:type="dxa"/>
             <w:tcBorders>
               <w:top w:val="single" w:sz="6" w:space="0" w:color="000000"/>
               <w:left w:val="single" w:sz="6" w:space="0" w:color="000000"/>
@@ -5596,7 +5923,7 @@
         </w:tc>
         <w:tc>
           <w:tcPr>
-            <w:tcW w:w="0" w:type="auto"/>
+            <w:tcW w:w="420" w:type="dxa"/>
             <w:tcBorders>
               <w:top w:val="single" w:sz="6" w:space="0" w:color="000000"/>
               <w:left w:val="single" w:sz="6" w:space="0" w:color="000000"/>
@@ -5623,11 +5950,41 @@
             </w:pPr>
           </w:p>
         </w:tc>
+        <w:tc>
+          <w:tcPr>
+            <w:tcW w:w="2766" w:type="dxa"/>
+            <w:tcBorders>
+              <w:top w:val="single" w:sz="6" w:space="0" w:color="000000"/>
+              <w:left w:val="single" w:sz="6" w:space="0" w:color="000000"/>
+              <w:bottom w:val="single" w:sz="6" w:space="0" w:color="000000"/>
+              <w:right w:val="single" w:sz="6" w:space="0" w:color="000000"/>
+            </w:tcBorders>
+            <w:tcMar>
+              <w:top w:w="120" w:type="dxa"/>
+              <w:left w:w="120" w:type="dxa"/>
+              <w:bottom w:w="120" w:type="dxa"/>
+              <w:right w:w="120" w:type="dxa"/>
+            </w:tcMar>
+            <w:hideMark/>
+          </w:tcPr>
+          <w:p>
+            <w:pPr>
+              <w:spacing w:before="200" w:after="200" w:line="240" w:lineRule="auto"/>
+              <w:rPr>
+                <w:rFonts w:ascii="Times New Roman" w:eastAsia="Times New Roman" w:hAnsi="Times New Roman" w:cs="Times New Roman"/>
+                <w:lang w:eastAsia="en-ID"/>
+              </w:rPr>
+            </w:pPr>
+          </w:p>
+        </w:tc>
       </w:tr>
       <w:tr>
-        <w:tc>
-          <w:tcPr>
-            <w:tcW w:w="0" w:type="auto"/>
+        <w:trPr>
+          <w:trHeight w:val="624" w:hRule="atLeast"/>
+        </w:trPr>
+        <w:tc>
+          <w:tcPr>
+            <w:tcW w:w="480" w:type="dxa"/>
             <w:tcBorders>
               <w:top w:val="single" w:sz="6" w:space="0" w:color="000000"/>
               <w:left w:val="single" w:sz="6" w:space="0" w:color="000000"/>
@@ -5662,7 +6019,7 @@
         </w:tc>
         <w:tc>
           <w:tcPr>
-            <w:tcW w:w="0" w:type="auto"/>
+            <w:tcW w:w="4100" w:type="dxa"/>
             <w:tcBorders>
               <w:top w:val="single" w:sz="6" w:space="0" w:color="000000"/>
               <w:left w:val="single" w:sz="6" w:space="0" w:color="000000"/>
@@ -5810,34 +6167,34 @@
         </w:tc>
         <w:tc>
           <w:tcPr>
-            <w:tcW w:w="0" w:type="auto"/>
-            <w:tcBorders>
-              <w:top w:val="single" w:sz="6" w:space="0" w:color="000000"/>
-              <w:left w:val="single" w:sz="6" w:space="0" w:color="000000"/>
-              <w:bottom w:val="single" w:sz="6" w:space="0" w:color="000000"/>
-              <w:right w:val="single" w:sz="6" w:space="0" w:color="000000"/>
-            </w:tcBorders>
-            <w:tcMar>
-              <w:top w:w="120" w:type="dxa"/>
-              <w:left w:w="120" w:type="dxa"/>
-              <w:bottom w:w="120" w:type="dxa"/>
-              <w:right w:w="120" w:type="dxa"/>
-            </w:tcMar>
-            <w:hideMark/>
-          </w:tcPr>
-          <w:p>
-            <w:pPr>
-              <w:spacing w:before="200" w:after="200" w:line="240" w:lineRule="auto"/>
-              <w:rPr>
-                <w:rFonts w:ascii="Times New Roman" w:eastAsia="Times New Roman" w:hAnsi="Times New Roman" w:cs="Times New Roman"/>
-                <w:lang w:eastAsia="en-ID"/>
-              </w:rPr>
-            </w:pPr>
-          </w:p>
-        </w:tc>
-        <w:tc>
-          <w:tcPr>
-            <w:tcW w:w="0" w:type="auto"/>
+            <w:tcW w:w="420" w:type="dxa"/>
+            <w:tcBorders>
+              <w:top w:val="single" w:sz="6" w:space="0" w:color="000000"/>
+              <w:left w:val="single" w:sz="6" w:space="0" w:color="000000"/>
+              <w:bottom w:val="single" w:sz="6" w:space="0" w:color="000000"/>
+              <w:right w:val="single" w:sz="6" w:space="0" w:color="000000"/>
+            </w:tcBorders>
+            <w:tcMar>
+              <w:top w:w="120" w:type="dxa"/>
+              <w:left w:w="120" w:type="dxa"/>
+              <w:bottom w:w="120" w:type="dxa"/>
+              <w:right w:w="120" w:type="dxa"/>
+            </w:tcMar>
+            <w:hideMark/>
+          </w:tcPr>
+          <w:p>
+            <w:pPr>
+              <w:spacing w:before="200" w:after="200" w:line="240" w:lineRule="auto"/>
+              <w:rPr>
+                <w:rFonts w:ascii="Times New Roman" w:eastAsia="Times New Roman" w:hAnsi="Times New Roman" w:cs="Times New Roman"/>
+                <w:lang w:eastAsia="en-ID"/>
+              </w:rPr>
+            </w:pPr>
+          </w:p>
+        </w:tc>
+        <w:tc>
+          <w:tcPr>
+            <w:tcW w:w="420" w:type="dxa"/>
             <w:tcBorders>
               <w:top w:val="single" w:sz="6" w:space="0" w:color="000000"/>
               <w:left w:val="single" w:sz="6" w:space="0" w:color="000000"/>
@@ -5866,7 +6223,7 @@
         </w:tc>
         <w:tc>
           <w:tcPr>
-            <w:tcW w:w="0" w:type="auto"/>
+            <w:tcW w:w="420" w:type="dxa"/>
             <w:tcBorders>
               <w:top w:val="single" w:sz="6" w:space="0" w:color="000000"/>
               <w:left w:val="single" w:sz="6" w:space="0" w:color="000000"/>
@@ -5895,7 +6252,7 @@
         </w:tc>
         <w:tc>
           <w:tcPr>
-            <w:tcW w:w="0" w:type="auto"/>
+            <w:tcW w:w="420" w:type="dxa"/>
             <w:tcBorders>
               <w:top w:val="single" w:sz="6" w:space="0" w:color="000000"/>
               <w:left w:val="single" w:sz="6" w:space="0" w:color="000000"/>
@@ -5922,11 +6279,41 @@
             </w:pPr>
           </w:p>
         </w:tc>
+        <w:tc>
+          <w:tcPr>
+            <w:tcW w:w="2766" w:type="dxa"/>
+            <w:tcBorders>
+              <w:top w:val="single" w:sz="6" w:space="0" w:color="000000"/>
+              <w:left w:val="single" w:sz="6" w:space="0" w:color="000000"/>
+              <w:bottom w:val="single" w:sz="6" w:space="0" w:color="000000"/>
+              <w:right w:val="single" w:sz="6" w:space="0" w:color="000000"/>
+            </w:tcBorders>
+            <w:tcMar>
+              <w:top w:w="120" w:type="dxa"/>
+              <w:left w:w="120" w:type="dxa"/>
+              <w:bottom w:w="120" w:type="dxa"/>
+              <w:right w:w="120" w:type="dxa"/>
+            </w:tcMar>
+            <w:hideMark/>
+          </w:tcPr>
+          <w:p>
+            <w:pPr>
+              <w:spacing w:before="200" w:after="200" w:line="240" w:lineRule="auto"/>
+              <w:rPr>
+                <w:rFonts w:ascii="Times New Roman" w:eastAsia="Times New Roman" w:hAnsi="Times New Roman" w:cs="Times New Roman"/>
+                <w:lang w:eastAsia="en-ID"/>
+              </w:rPr>
+            </w:pPr>
+          </w:p>
+        </w:tc>
       </w:tr>
       <w:tr>
-        <w:tc>
-          <w:tcPr>
-            <w:tcW w:w="0" w:type="auto"/>
+        <w:trPr>
+          <w:trHeight w:val="624" w:hRule="atLeast"/>
+        </w:trPr>
+        <w:tc>
+          <w:tcPr>
+            <w:tcW w:w="480" w:type="dxa"/>
             <w:tcBorders>
               <w:top w:val="single" w:sz="6" w:space="0" w:color="000000"/>
               <w:left w:val="single" w:sz="6" w:space="0" w:color="000000"/>
@@ -5961,7 +6348,7 @@
         </w:tc>
         <w:tc>
           <w:tcPr>
-            <w:tcW w:w="0" w:type="auto"/>
+            <w:tcW w:w="4100" w:type="dxa"/>
             <w:tcBorders>
               <w:top w:val="single" w:sz="6" w:space="0" w:color="000000"/>
               <w:left w:val="single" w:sz="6" w:space="0" w:color="000000"/>
@@ -6125,34 +6512,34 @@
         </w:tc>
         <w:tc>
           <w:tcPr>
-            <w:tcW w:w="0" w:type="auto"/>
-            <w:tcBorders>
-              <w:top w:val="single" w:sz="6" w:space="0" w:color="000000"/>
-              <w:left w:val="single" w:sz="6" w:space="0" w:color="000000"/>
-              <w:bottom w:val="single" w:sz="6" w:space="0" w:color="000000"/>
-              <w:right w:val="single" w:sz="6" w:space="0" w:color="000000"/>
-            </w:tcBorders>
-            <w:tcMar>
-              <w:top w:w="120" w:type="dxa"/>
-              <w:left w:w="120" w:type="dxa"/>
-              <w:bottom w:w="120" w:type="dxa"/>
-              <w:right w:w="120" w:type="dxa"/>
-            </w:tcMar>
-            <w:hideMark/>
-          </w:tcPr>
-          <w:p>
-            <w:pPr>
-              <w:spacing w:before="200" w:after="200" w:line="240" w:lineRule="auto"/>
-              <w:rPr>
-                <w:rFonts w:ascii="Times New Roman" w:eastAsia="Times New Roman" w:hAnsi="Times New Roman" w:cs="Times New Roman"/>
-                <w:lang w:eastAsia="en-ID"/>
-              </w:rPr>
-            </w:pPr>
-          </w:p>
-        </w:tc>
-        <w:tc>
-          <w:tcPr>
-            <w:tcW w:w="0" w:type="auto"/>
+            <w:tcW w:w="420" w:type="dxa"/>
+            <w:tcBorders>
+              <w:top w:val="single" w:sz="6" w:space="0" w:color="000000"/>
+              <w:left w:val="single" w:sz="6" w:space="0" w:color="000000"/>
+              <w:bottom w:val="single" w:sz="6" w:space="0" w:color="000000"/>
+              <w:right w:val="single" w:sz="6" w:space="0" w:color="000000"/>
+            </w:tcBorders>
+            <w:tcMar>
+              <w:top w:w="120" w:type="dxa"/>
+              <w:left w:w="120" w:type="dxa"/>
+              <w:bottom w:w="120" w:type="dxa"/>
+              <w:right w:w="120" w:type="dxa"/>
+            </w:tcMar>
+            <w:hideMark/>
+          </w:tcPr>
+          <w:p>
+            <w:pPr>
+              <w:spacing w:before="200" w:after="200" w:line="240" w:lineRule="auto"/>
+              <w:rPr>
+                <w:rFonts w:ascii="Times New Roman" w:eastAsia="Times New Roman" w:hAnsi="Times New Roman" w:cs="Times New Roman"/>
+                <w:lang w:eastAsia="en-ID"/>
+              </w:rPr>
+            </w:pPr>
+          </w:p>
+        </w:tc>
+        <w:tc>
+          <w:tcPr>
+            <w:tcW w:w="420" w:type="dxa"/>
             <w:tcBorders>
               <w:top w:val="single" w:sz="6" w:space="0" w:color="000000"/>
               <w:left w:val="single" w:sz="6" w:space="0" w:color="000000"/>
@@ -6181,7 +6568,7 @@
         </w:tc>
         <w:tc>
           <w:tcPr>
-            <w:tcW w:w="0" w:type="auto"/>
+            <w:tcW w:w="420" w:type="dxa"/>
             <w:tcBorders>
               <w:top w:val="single" w:sz="6" w:space="0" w:color="000000"/>
               <w:left w:val="single" w:sz="6" w:space="0" w:color="000000"/>
@@ -6210,7 +6597,7 @@
         </w:tc>
         <w:tc>
           <w:tcPr>
-            <w:tcW w:w="0" w:type="auto"/>
+            <w:tcW w:w="420" w:type="dxa"/>
             <w:tcBorders>
               <w:top w:val="single" w:sz="6" w:space="0" w:color="000000"/>
               <w:left w:val="single" w:sz="6" w:space="0" w:color="000000"/>
@@ -6237,11 +6624,41 @@
             </w:pPr>
           </w:p>
         </w:tc>
+        <w:tc>
+          <w:tcPr>
+            <w:tcW w:w="2766" w:type="dxa"/>
+            <w:tcBorders>
+              <w:top w:val="single" w:sz="6" w:space="0" w:color="000000"/>
+              <w:left w:val="single" w:sz="6" w:space="0" w:color="000000"/>
+              <w:bottom w:val="single" w:sz="6" w:space="0" w:color="000000"/>
+              <w:right w:val="single" w:sz="6" w:space="0" w:color="000000"/>
+            </w:tcBorders>
+            <w:tcMar>
+              <w:top w:w="120" w:type="dxa"/>
+              <w:left w:w="120" w:type="dxa"/>
+              <w:bottom w:w="120" w:type="dxa"/>
+              <w:right w:w="120" w:type="dxa"/>
+            </w:tcMar>
+            <w:hideMark/>
+          </w:tcPr>
+          <w:p>
+            <w:pPr>
+              <w:spacing w:before="200" w:after="200" w:line="240" w:lineRule="auto"/>
+              <w:rPr>
+                <w:rFonts w:ascii="Times New Roman" w:eastAsia="Times New Roman" w:hAnsi="Times New Roman" w:cs="Times New Roman"/>
+                <w:lang w:eastAsia="en-ID"/>
+              </w:rPr>
+            </w:pPr>
+          </w:p>
+        </w:tc>
       </w:tr>
       <w:tr>
-        <w:tc>
-          <w:tcPr>
-            <w:tcW w:w="0" w:type="auto"/>
+        <w:trPr>
+          <w:trHeight w:val="624" w:hRule="atLeast"/>
+        </w:trPr>
+        <w:tc>
+          <w:tcPr>
+            <w:tcW w:w="480" w:type="dxa"/>
             <w:tcBorders>
               <w:top w:val="single" w:sz="6" w:space="0" w:color="000000"/>
               <w:left w:val="single" w:sz="6" w:space="0" w:color="000000"/>
@@ -6276,7 +6693,7 @@
         </w:tc>
         <w:tc>
           <w:tcPr>
-            <w:tcW w:w="0" w:type="auto"/>
+            <w:tcW w:w="4100" w:type="dxa"/>
             <w:tcBorders>
               <w:top w:val="single" w:sz="6" w:space="0" w:color="000000"/>
               <w:left w:val="single" w:sz="6" w:space="0" w:color="000000"/>
@@ -6424,34 +6841,34 @@
         </w:tc>
         <w:tc>
           <w:tcPr>
-            <w:tcW w:w="0" w:type="auto"/>
-            <w:tcBorders>
-              <w:top w:val="single" w:sz="6" w:space="0" w:color="000000"/>
-              <w:left w:val="single" w:sz="6" w:space="0" w:color="000000"/>
-              <w:bottom w:val="single" w:sz="6" w:space="0" w:color="000000"/>
-              <w:right w:val="single" w:sz="6" w:space="0" w:color="000000"/>
-            </w:tcBorders>
-            <w:tcMar>
-              <w:top w:w="120" w:type="dxa"/>
-              <w:left w:w="120" w:type="dxa"/>
-              <w:bottom w:w="120" w:type="dxa"/>
-              <w:right w:w="120" w:type="dxa"/>
-            </w:tcMar>
-            <w:hideMark/>
-          </w:tcPr>
-          <w:p>
-            <w:pPr>
-              <w:spacing w:before="200" w:after="200" w:line="240" w:lineRule="auto"/>
-              <w:rPr>
-                <w:rFonts w:ascii="Times New Roman" w:eastAsia="Times New Roman" w:hAnsi="Times New Roman" w:cs="Times New Roman"/>
-                <w:lang w:eastAsia="en-ID"/>
-              </w:rPr>
-            </w:pPr>
-          </w:p>
-        </w:tc>
-        <w:tc>
-          <w:tcPr>
-            <w:tcW w:w="0" w:type="auto"/>
+            <w:tcW w:w="420" w:type="dxa"/>
+            <w:tcBorders>
+              <w:top w:val="single" w:sz="6" w:space="0" w:color="000000"/>
+              <w:left w:val="single" w:sz="6" w:space="0" w:color="000000"/>
+              <w:bottom w:val="single" w:sz="6" w:space="0" w:color="000000"/>
+              <w:right w:val="single" w:sz="6" w:space="0" w:color="000000"/>
+            </w:tcBorders>
+            <w:tcMar>
+              <w:top w:w="120" w:type="dxa"/>
+              <w:left w:w="120" w:type="dxa"/>
+              <w:bottom w:w="120" w:type="dxa"/>
+              <w:right w:w="120" w:type="dxa"/>
+            </w:tcMar>
+            <w:hideMark/>
+          </w:tcPr>
+          <w:p>
+            <w:pPr>
+              <w:spacing w:before="200" w:after="200" w:line="240" w:lineRule="auto"/>
+              <w:rPr>
+                <w:rFonts w:ascii="Times New Roman" w:eastAsia="Times New Roman" w:hAnsi="Times New Roman" w:cs="Times New Roman"/>
+                <w:lang w:eastAsia="en-ID"/>
+              </w:rPr>
+            </w:pPr>
+          </w:p>
+        </w:tc>
+        <w:tc>
+          <w:tcPr>
+            <w:tcW w:w="420" w:type="dxa"/>
             <w:tcBorders>
               <w:top w:val="single" w:sz="6" w:space="0" w:color="000000"/>
               <w:left w:val="single" w:sz="6" w:space="0" w:color="000000"/>
@@ -6480,7 +6897,7 @@
         </w:tc>
         <w:tc>
           <w:tcPr>
-            <w:tcW w:w="0" w:type="auto"/>
+            <w:tcW w:w="420" w:type="dxa"/>
             <w:tcBorders>
               <w:top w:val="single" w:sz="6" w:space="0" w:color="000000"/>
               <w:left w:val="single" w:sz="6" w:space="0" w:color="000000"/>
@@ -6509,7 +6926,7 @@
         </w:tc>
         <w:tc>
           <w:tcPr>
-            <w:tcW w:w="0" w:type="auto"/>
+            <w:tcW w:w="420" w:type="dxa"/>
             <w:tcBorders>
               <w:top w:val="single" w:sz="6" w:space="0" w:color="000000"/>
               <w:left w:val="single" w:sz="6" w:space="0" w:color="000000"/>
@@ -6531,6 +6948,33 @@
                 <w:rFonts w:ascii="Times New Roman" w:eastAsia="Times New Roman" w:hAnsi="Times New Roman" w:cs="Times New Roman"/>
                 <w:sz w:val="20"/>
                 <w:szCs w:val="20"/>
+                <w:lang w:eastAsia="en-ID"/>
+              </w:rPr>
+            </w:pPr>
+          </w:p>
+        </w:tc>
+        <w:tc>
+          <w:tcPr>
+            <w:tcW w:w="2766" w:type="dxa"/>
+            <w:tcBorders>
+              <w:top w:val="single" w:sz="6" w:space="0" w:color="000000"/>
+              <w:left w:val="single" w:sz="6" w:space="0" w:color="000000"/>
+              <w:bottom w:val="single" w:sz="6" w:space="0" w:color="000000"/>
+              <w:right w:val="single" w:sz="6" w:space="0" w:color="000000"/>
+            </w:tcBorders>
+            <w:tcMar>
+              <w:top w:w="120" w:type="dxa"/>
+              <w:left w:w="120" w:type="dxa"/>
+              <w:bottom w:w="120" w:type="dxa"/>
+              <w:right w:w="120" w:type="dxa"/>
+            </w:tcMar>
+            <w:hideMark/>
+          </w:tcPr>
+          <w:p>
+            <w:pPr>
+              <w:spacing w:before="200" w:after="200" w:line="240" w:lineRule="auto"/>
+              <w:rPr>
+                <w:rFonts w:ascii="Times New Roman" w:eastAsia="Times New Roman" w:hAnsi="Times New Roman" w:cs="Times New Roman"/>
                 <w:lang w:eastAsia="en-ID"/>
               </w:rPr>
             </w:pPr>
@@ -6828,7 +7272,7 @@
     </w:p>
     <w:tbl>
       <w:tblPr>
-        <w:tblW w:w="4605" w:type="pct"/>
+        <w:tblW w:w="9026" w:type="dxa"/>
         <w:tblBorders>
           <w:top w:val="single" w:sz="6" w:space="0" w:color="000000"/>
           <w:left w:val="single" w:sz="6" w:space="0" w:color="000000"/>
@@ -6844,17 +7288,18 @@
         <w:tblLook w:val="04A0" w:firstRow="1" w:lastRow="0" w:firstColumn="1" w:lastColumn="0" w:noHBand="0" w:noVBand="1"/>
       </w:tblPr>
       <w:tblGrid>
-        <w:gridCol w:w="510"/>
-        <w:gridCol w:w="4948"/>
-        <w:gridCol w:w="710"/>
-        <w:gridCol w:w="710"/>
-        <w:gridCol w:w="710"/>
-        <w:gridCol w:w="710"/>
+        <w:gridCol w:w="480"/>
+        <w:gridCol w:w="4100"/>
+        <w:gridCol w:w="420"/>
+        <w:gridCol w:w="420"/>
+        <w:gridCol w:w="420"/>
+        <w:gridCol w:w="420"/>
+        <w:gridCol w:w="2766"/>
       </w:tblGrid>
       <w:tr>
         <w:tc>
           <w:tcPr>
-            <w:tcW w:w="307" w:type="pct"/>
+            <w:tcW w:w="480" w:type="dxa"/>
             <w:tcBorders>
               <w:top w:val="single" w:sz="6" w:space="0" w:color="000000"/>
               <w:left w:val="single" w:sz="6" w:space="0" w:color="000000"/>
@@ -6895,7 +7340,7 @@
         </w:tc>
         <w:tc>
           <w:tcPr>
-            <w:tcW w:w="2980" w:type="pct"/>
+            <w:tcW w:w="4100" w:type="dxa"/>
             <w:tcBorders>
               <w:top w:val="single" w:sz="6" w:space="0" w:color="000000"/>
               <w:left w:val="single" w:sz="6" w:space="0" w:color="000000"/>
@@ -6938,7 +7383,7 @@
         </w:tc>
         <w:tc>
           <w:tcPr>
-            <w:tcW w:w="428" w:type="pct"/>
+            <w:tcW w:w="420" w:type="dxa"/>
             <w:tcBorders>
               <w:top w:val="single" w:sz="6" w:space="0" w:color="000000"/>
               <w:left w:val="single" w:sz="6" w:space="0" w:color="000000"/>
@@ -6979,7 +7424,7 @@
         </w:tc>
         <w:tc>
           <w:tcPr>
-            <w:tcW w:w="428" w:type="pct"/>
+            <w:tcW w:w="420" w:type="dxa"/>
             <w:tcBorders>
               <w:top w:val="single" w:sz="6" w:space="0" w:color="000000"/>
               <w:left w:val="single" w:sz="6" w:space="0" w:color="000000"/>
@@ -7020,7 +7465,7 @@
         </w:tc>
         <w:tc>
           <w:tcPr>
-            <w:tcW w:w="428" w:type="pct"/>
+            <w:tcW w:w="420" w:type="dxa"/>
             <w:tcBorders>
               <w:top w:val="single" w:sz="6" w:space="0" w:color="000000"/>
               <w:left w:val="single" w:sz="6" w:space="0" w:color="000000"/>
@@ -7061,7 +7506,7 @@
         </w:tc>
         <w:tc>
           <w:tcPr>
-            <w:tcW w:w="428" w:type="pct"/>
+            <w:tcW w:w="420" w:type="dxa"/>
             <w:tcBorders>
               <w:top w:val="single" w:sz="6" w:space="0" w:color="000000"/>
               <w:left w:val="single" w:sz="6" w:space="0" w:color="000000"/>
@@ -7100,11 +7545,55 @@
             </w:r>
           </w:p>
         </w:tc>
+        <w:tc>
+          <w:tcPr>
+            <w:tcW w:w="2766" w:type="dxa"/>
+            <w:tcBorders>
+              <w:top w:val="single" w:sz="6" w:space="0" w:color="000000"/>
+              <w:left w:val="single" w:sz="6" w:space="0" w:color="000000"/>
+              <w:bottom w:val="single" w:sz="6" w:space="0" w:color="000000"/>
+              <w:right w:val="single" w:sz="6" w:space="0" w:color="000000"/>
+            </w:tcBorders>
+            <w:shd w:val="clear" w:color="auto" w:fill="F0F0F0"/>
+            <w:tcMar>
+              <w:top w:w="120" w:type="dxa"/>
+              <w:left w:w="120" w:type="dxa"/>
+              <w:bottom w:w="120" w:type="dxa"/>
+              <w:right w:w="120" w:type="dxa"/>
+            </w:tcMar>
+            <w:vAlign w:val="center"/>
+            <w:hideMark/>
+          </w:tcPr>
+          <w:p>
+            <w:pPr>
+              <w:spacing w:before="200" w:after="200" w:line="240" w:lineRule="auto"/>
+              <w:jc w:val="center"/>
+              <w:rPr>
+                <w:rFonts w:ascii="Times New Roman" w:eastAsia="Times New Roman" w:hAnsi="Times New Roman" w:cs="Times New Roman"/>
+                <w:b/>
+                <w:bCs/>
+                <w:lang w:eastAsia="en-ID"/>
+              </w:rPr>
+            </w:pPr>
+            <w:r>
+              <w:rPr>
+                <w:rFonts w:ascii="Times New Roman" w:eastAsia="Times New Roman" w:hAnsi="Times New Roman" w:cs="Times New Roman"/>
+                <w:b/>
+                <w:bCs/>
+                <w:lang w:eastAsia="en-ID"/>
+              </w:rPr>
+              <w:t>Catatan</w:t>
+            </w:r>
+          </w:p>
+        </w:tc>
       </w:tr>
       <w:tr>
-        <w:tc>
-          <w:tcPr>
-            <w:tcW w:w="0" w:type="auto"/>
+        <w:trPr>
+          <w:trHeight w:val="624" w:hRule="atLeast"/>
+        </w:trPr>
+        <w:tc>
+          <w:tcPr>
+            <w:tcW w:w="480" w:type="dxa"/>
             <w:tcBorders>
               <w:top w:val="single" w:sz="6" w:space="0" w:color="000000"/>
               <w:left w:val="single" w:sz="6" w:space="0" w:color="000000"/>
@@ -7139,7 +7628,7 @@
         </w:tc>
         <w:tc>
           <w:tcPr>
-            <w:tcW w:w="0" w:type="auto"/>
+            <w:tcW w:w="4100" w:type="dxa"/>
             <w:tcBorders>
               <w:top w:val="single" w:sz="6" w:space="0" w:color="000000"/>
               <w:left w:val="single" w:sz="6" w:space="0" w:color="000000"/>
@@ -7335,34 +7824,34 @@
         </w:tc>
         <w:tc>
           <w:tcPr>
-            <w:tcW w:w="0" w:type="auto"/>
-            <w:tcBorders>
-              <w:top w:val="single" w:sz="6" w:space="0" w:color="000000"/>
-              <w:left w:val="single" w:sz="6" w:space="0" w:color="000000"/>
-              <w:bottom w:val="single" w:sz="6" w:space="0" w:color="000000"/>
-              <w:right w:val="single" w:sz="6" w:space="0" w:color="000000"/>
-            </w:tcBorders>
-            <w:tcMar>
-              <w:top w:w="120" w:type="dxa"/>
-              <w:left w:w="120" w:type="dxa"/>
-              <w:bottom w:w="120" w:type="dxa"/>
-              <w:right w:w="120" w:type="dxa"/>
-            </w:tcMar>
-            <w:hideMark/>
-          </w:tcPr>
-          <w:p>
-            <w:pPr>
-              <w:spacing w:before="200" w:after="200" w:line="240" w:lineRule="auto"/>
-              <w:rPr>
-                <w:rFonts w:ascii="Times New Roman" w:eastAsia="Times New Roman" w:hAnsi="Times New Roman" w:cs="Times New Roman"/>
-                <w:lang w:eastAsia="en-ID"/>
-              </w:rPr>
-            </w:pPr>
-          </w:p>
-        </w:tc>
-        <w:tc>
-          <w:tcPr>
-            <w:tcW w:w="0" w:type="auto"/>
+            <w:tcW w:w="420" w:type="dxa"/>
+            <w:tcBorders>
+              <w:top w:val="single" w:sz="6" w:space="0" w:color="000000"/>
+              <w:left w:val="single" w:sz="6" w:space="0" w:color="000000"/>
+              <w:bottom w:val="single" w:sz="6" w:space="0" w:color="000000"/>
+              <w:right w:val="single" w:sz="6" w:space="0" w:color="000000"/>
+            </w:tcBorders>
+            <w:tcMar>
+              <w:top w:w="120" w:type="dxa"/>
+              <w:left w:w="120" w:type="dxa"/>
+              <w:bottom w:w="120" w:type="dxa"/>
+              <w:right w:w="120" w:type="dxa"/>
+            </w:tcMar>
+            <w:hideMark/>
+          </w:tcPr>
+          <w:p>
+            <w:pPr>
+              <w:spacing w:before="200" w:after="200" w:line="240" w:lineRule="auto"/>
+              <w:rPr>
+                <w:rFonts w:ascii="Times New Roman" w:eastAsia="Times New Roman" w:hAnsi="Times New Roman" w:cs="Times New Roman"/>
+                <w:lang w:eastAsia="en-ID"/>
+              </w:rPr>
+            </w:pPr>
+          </w:p>
+        </w:tc>
+        <w:tc>
+          <w:tcPr>
+            <w:tcW w:w="420" w:type="dxa"/>
             <w:tcBorders>
               <w:top w:val="single" w:sz="6" w:space="0" w:color="000000"/>
               <w:left w:val="single" w:sz="6" w:space="0" w:color="000000"/>
@@ -7391,7 +7880,7 @@
         </w:tc>
         <w:tc>
           <w:tcPr>
-            <w:tcW w:w="0" w:type="auto"/>
+            <w:tcW w:w="420" w:type="dxa"/>
             <w:tcBorders>
               <w:top w:val="single" w:sz="6" w:space="0" w:color="000000"/>
               <w:left w:val="single" w:sz="6" w:space="0" w:color="000000"/>
@@ -7420,7 +7909,7 @@
         </w:tc>
         <w:tc>
           <w:tcPr>
-            <w:tcW w:w="0" w:type="auto"/>
+            <w:tcW w:w="420" w:type="dxa"/>
             <w:tcBorders>
               <w:top w:val="single" w:sz="6" w:space="0" w:color="000000"/>
               <w:left w:val="single" w:sz="6" w:space="0" w:color="000000"/>
@@ -7447,11 +7936,41 @@
             </w:pPr>
           </w:p>
         </w:tc>
+        <w:tc>
+          <w:tcPr>
+            <w:tcW w:w="2766" w:type="dxa"/>
+            <w:tcBorders>
+              <w:top w:val="single" w:sz="6" w:space="0" w:color="000000"/>
+              <w:left w:val="single" w:sz="6" w:space="0" w:color="000000"/>
+              <w:bottom w:val="single" w:sz="6" w:space="0" w:color="000000"/>
+              <w:right w:val="single" w:sz="6" w:space="0" w:color="000000"/>
+            </w:tcBorders>
+            <w:tcMar>
+              <w:top w:w="120" w:type="dxa"/>
+              <w:left w:w="120" w:type="dxa"/>
+              <w:bottom w:w="120" w:type="dxa"/>
+              <w:right w:w="120" w:type="dxa"/>
+            </w:tcMar>
+            <w:hideMark/>
+          </w:tcPr>
+          <w:p>
+            <w:pPr>
+              <w:spacing w:before="200" w:after="200" w:line="240" w:lineRule="auto"/>
+              <w:rPr>
+                <w:rFonts w:ascii="Times New Roman" w:eastAsia="Times New Roman" w:hAnsi="Times New Roman" w:cs="Times New Roman"/>
+                <w:lang w:eastAsia="en-ID"/>
+              </w:rPr>
+            </w:pPr>
+          </w:p>
+        </w:tc>
       </w:tr>
       <w:tr>
-        <w:tc>
-          <w:tcPr>
-            <w:tcW w:w="0" w:type="auto"/>
+        <w:trPr>
+          <w:trHeight w:val="624" w:hRule="atLeast"/>
+        </w:trPr>
+        <w:tc>
+          <w:tcPr>
+            <w:tcW w:w="480" w:type="dxa"/>
             <w:tcBorders>
               <w:top w:val="single" w:sz="6" w:space="0" w:color="000000"/>
               <w:left w:val="single" w:sz="6" w:space="0" w:color="000000"/>
@@ -7486,7 +8005,7 @@
         </w:tc>
         <w:tc>
           <w:tcPr>
-            <w:tcW w:w="0" w:type="auto"/>
+            <w:tcW w:w="4100" w:type="dxa"/>
             <w:tcBorders>
               <w:top w:val="single" w:sz="6" w:space="0" w:color="000000"/>
               <w:left w:val="single" w:sz="6" w:space="0" w:color="000000"/>
@@ -7682,34 +8201,34 @@
         </w:tc>
         <w:tc>
           <w:tcPr>
-            <w:tcW w:w="0" w:type="auto"/>
-            <w:tcBorders>
-              <w:top w:val="single" w:sz="6" w:space="0" w:color="000000"/>
-              <w:left w:val="single" w:sz="6" w:space="0" w:color="000000"/>
-              <w:bottom w:val="single" w:sz="6" w:space="0" w:color="000000"/>
-              <w:right w:val="single" w:sz="6" w:space="0" w:color="000000"/>
-            </w:tcBorders>
-            <w:tcMar>
-              <w:top w:w="120" w:type="dxa"/>
-              <w:left w:w="120" w:type="dxa"/>
-              <w:bottom w:w="120" w:type="dxa"/>
-              <w:right w:w="120" w:type="dxa"/>
-            </w:tcMar>
-            <w:hideMark/>
-          </w:tcPr>
-          <w:p>
-            <w:pPr>
-              <w:spacing w:before="200" w:after="200" w:line="240" w:lineRule="auto"/>
-              <w:rPr>
-                <w:rFonts w:ascii="Times New Roman" w:eastAsia="Times New Roman" w:hAnsi="Times New Roman" w:cs="Times New Roman"/>
-                <w:lang w:eastAsia="en-ID"/>
-              </w:rPr>
-            </w:pPr>
-          </w:p>
-        </w:tc>
-        <w:tc>
-          <w:tcPr>
-            <w:tcW w:w="0" w:type="auto"/>
+            <w:tcW w:w="420" w:type="dxa"/>
+            <w:tcBorders>
+              <w:top w:val="single" w:sz="6" w:space="0" w:color="000000"/>
+              <w:left w:val="single" w:sz="6" w:space="0" w:color="000000"/>
+              <w:bottom w:val="single" w:sz="6" w:space="0" w:color="000000"/>
+              <w:right w:val="single" w:sz="6" w:space="0" w:color="000000"/>
+            </w:tcBorders>
+            <w:tcMar>
+              <w:top w:w="120" w:type="dxa"/>
+              <w:left w:w="120" w:type="dxa"/>
+              <w:bottom w:w="120" w:type="dxa"/>
+              <w:right w:w="120" w:type="dxa"/>
+            </w:tcMar>
+            <w:hideMark/>
+          </w:tcPr>
+          <w:p>
+            <w:pPr>
+              <w:spacing w:before="200" w:after="200" w:line="240" w:lineRule="auto"/>
+              <w:rPr>
+                <w:rFonts w:ascii="Times New Roman" w:eastAsia="Times New Roman" w:hAnsi="Times New Roman" w:cs="Times New Roman"/>
+                <w:lang w:eastAsia="en-ID"/>
+              </w:rPr>
+            </w:pPr>
+          </w:p>
+        </w:tc>
+        <w:tc>
+          <w:tcPr>
+            <w:tcW w:w="420" w:type="dxa"/>
             <w:tcBorders>
               <w:top w:val="single" w:sz="6" w:space="0" w:color="000000"/>
               <w:left w:val="single" w:sz="6" w:space="0" w:color="000000"/>
@@ -7738,7 +8257,7 @@
         </w:tc>
         <w:tc>
           <w:tcPr>
-            <w:tcW w:w="0" w:type="auto"/>
+            <w:tcW w:w="420" w:type="dxa"/>
             <w:tcBorders>
               <w:top w:val="single" w:sz="6" w:space="0" w:color="000000"/>
               <w:left w:val="single" w:sz="6" w:space="0" w:color="000000"/>
@@ -7767,7 +8286,7 @@
         </w:tc>
         <w:tc>
           <w:tcPr>
-            <w:tcW w:w="0" w:type="auto"/>
+            <w:tcW w:w="420" w:type="dxa"/>
             <w:tcBorders>
               <w:top w:val="single" w:sz="6" w:space="0" w:color="000000"/>
               <w:left w:val="single" w:sz="6" w:space="0" w:color="000000"/>
@@ -7794,11 +8313,41 @@
             </w:pPr>
           </w:p>
         </w:tc>
+        <w:tc>
+          <w:tcPr>
+            <w:tcW w:w="2766" w:type="dxa"/>
+            <w:tcBorders>
+              <w:top w:val="single" w:sz="6" w:space="0" w:color="000000"/>
+              <w:left w:val="single" w:sz="6" w:space="0" w:color="000000"/>
+              <w:bottom w:val="single" w:sz="6" w:space="0" w:color="000000"/>
+              <w:right w:val="single" w:sz="6" w:space="0" w:color="000000"/>
+            </w:tcBorders>
+            <w:tcMar>
+              <w:top w:w="120" w:type="dxa"/>
+              <w:left w:w="120" w:type="dxa"/>
+              <w:bottom w:w="120" w:type="dxa"/>
+              <w:right w:w="120" w:type="dxa"/>
+            </w:tcMar>
+            <w:hideMark/>
+          </w:tcPr>
+          <w:p>
+            <w:pPr>
+              <w:spacing w:before="200" w:after="200" w:line="240" w:lineRule="auto"/>
+              <w:rPr>
+                <w:rFonts w:ascii="Times New Roman" w:eastAsia="Times New Roman" w:hAnsi="Times New Roman" w:cs="Times New Roman"/>
+                <w:lang w:eastAsia="en-ID"/>
+              </w:rPr>
+            </w:pPr>
+          </w:p>
+        </w:tc>
       </w:tr>
       <w:tr>
-        <w:tc>
-          <w:tcPr>
-            <w:tcW w:w="0" w:type="auto"/>
+        <w:trPr>
+          <w:trHeight w:val="624" w:hRule="atLeast"/>
+        </w:trPr>
+        <w:tc>
+          <w:tcPr>
+            <w:tcW w:w="480" w:type="dxa"/>
             <w:tcBorders>
               <w:top w:val="single" w:sz="6" w:space="0" w:color="000000"/>
               <w:left w:val="single" w:sz="6" w:space="0" w:color="000000"/>
@@ -7833,7 +8382,7 @@
         </w:tc>
         <w:tc>
           <w:tcPr>
-            <w:tcW w:w="0" w:type="auto"/>
+            <w:tcW w:w="4100" w:type="dxa"/>
             <w:tcBorders>
               <w:top w:val="single" w:sz="6" w:space="0" w:color="000000"/>
               <w:left w:val="single" w:sz="6" w:space="0" w:color="000000"/>
@@ -8013,34 +8562,34 @@
         </w:tc>
         <w:tc>
           <w:tcPr>
-            <w:tcW w:w="0" w:type="auto"/>
-            <w:tcBorders>
-              <w:top w:val="single" w:sz="6" w:space="0" w:color="000000"/>
-              <w:left w:val="single" w:sz="6" w:space="0" w:color="000000"/>
-              <w:bottom w:val="single" w:sz="6" w:space="0" w:color="000000"/>
-              <w:right w:val="single" w:sz="6" w:space="0" w:color="000000"/>
-            </w:tcBorders>
-            <w:tcMar>
-              <w:top w:w="120" w:type="dxa"/>
-              <w:left w:w="120" w:type="dxa"/>
-              <w:bottom w:w="120" w:type="dxa"/>
-              <w:right w:w="120" w:type="dxa"/>
-            </w:tcMar>
-            <w:hideMark/>
-          </w:tcPr>
-          <w:p>
-            <w:pPr>
-              <w:spacing w:before="200" w:after="200" w:line="240" w:lineRule="auto"/>
-              <w:rPr>
-                <w:rFonts w:ascii="Times New Roman" w:eastAsia="Times New Roman" w:hAnsi="Times New Roman" w:cs="Times New Roman"/>
-                <w:lang w:eastAsia="en-ID"/>
-              </w:rPr>
-            </w:pPr>
-          </w:p>
-        </w:tc>
-        <w:tc>
-          <w:tcPr>
-            <w:tcW w:w="0" w:type="auto"/>
+            <w:tcW w:w="420" w:type="dxa"/>
+            <w:tcBorders>
+              <w:top w:val="single" w:sz="6" w:space="0" w:color="000000"/>
+              <w:left w:val="single" w:sz="6" w:space="0" w:color="000000"/>
+              <w:bottom w:val="single" w:sz="6" w:space="0" w:color="000000"/>
+              <w:right w:val="single" w:sz="6" w:space="0" w:color="000000"/>
+            </w:tcBorders>
+            <w:tcMar>
+              <w:top w:w="120" w:type="dxa"/>
+              <w:left w:w="120" w:type="dxa"/>
+              <w:bottom w:w="120" w:type="dxa"/>
+              <w:right w:w="120" w:type="dxa"/>
+            </w:tcMar>
+            <w:hideMark/>
+          </w:tcPr>
+          <w:p>
+            <w:pPr>
+              <w:spacing w:before="200" w:after="200" w:line="240" w:lineRule="auto"/>
+              <w:rPr>
+                <w:rFonts w:ascii="Times New Roman" w:eastAsia="Times New Roman" w:hAnsi="Times New Roman" w:cs="Times New Roman"/>
+                <w:lang w:eastAsia="en-ID"/>
+              </w:rPr>
+            </w:pPr>
+          </w:p>
+        </w:tc>
+        <w:tc>
+          <w:tcPr>
+            <w:tcW w:w="420" w:type="dxa"/>
             <w:tcBorders>
               <w:top w:val="single" w:sz="6" w:space="0" w:color="000000"/>
               <w:left w:val="single" w:sz="6" w:space="0" w:color="000000"/>
@@ -8069,7 +8618,7 @@
         </w:tc>
         <w:tc>
           <w:tcPr>
-            <w:tcW w:w="0" w:type="auto"/>
+            <w:tcW w:w="420" w:type="dxa"/>
             <w:tcBorders>
               <w:top w:val="single" w:sz="6" w:space="0" w:color="000000"/>
               <w:left w:val="single" w:sz="6" w:space="0" w:color="000000"/>
@@ -8098,7 +8647,7 @@
         </w:tc>
         <w:tc>
           <w:tcPr>
-            <w:tcW w:w="0" w:type="auto"/>
+            <w:tcW w:w="420" w:type="dxa"/>
             <w:tcBorders>
               <w:top w:val="single" w:sz="6" w:space="0" w:color="000000"/>
               <w:left w:val="single" w:sz="6" w:space="0" w:color="000000"/>
@@ -8125,11 +8674,41 @@
             </w:pPr>
           </w:p>
         </w:tc>
+        <w:tc>
+          <w:tcPr>
+            <w:tcW w:w="2766" w:type="dxa"/>
+            <w:tcBorders>
+              <w:top w:val="single" w:sz="6" w:space="0" w:color="000000"/>
+              <w:left w:val="single" w:sz="6" w:space="0" w:color="000000"/>
+              <w:bottom w:val="single" w:sz="6" w:space="0" w:color="000000"/>
+              <w:right w:val="single" w:sz="6" w:space="0" w:color="000000"/>
+            </w:tcBorders>
+            <w:tcMar>
+              <w:top w:w="120" w:type="dxa"/>
+              <w:left w:w="120" w:type="dxa"/>
+              <w:bottom w:w="120" w:type="dxa"/>
+              <w:right w:w="120" w:type="dxa"/>
+            </w:tcMar>
+            <w:hideMark/>
+          </w:tcPr>
+          <w:p>
+            <w:pPr>
+              <w:spacing w:before="200" w:after="200" w:line="240" w:lineRule="auto"/>
+              <w:rPr>
+                <w:rFonts w:ascii="Times New Roman" w:eastAsia="Times New Roman" w:hAnsi="Times New Roman" w:cs="Times New Roman"/>
+                <w:lang w:eastAsia="en-ID"/>
+              </w:rPr>
+            </w:pPr>
+          </w:p>
+        </w:tc>
       </w:tr>
       <w:tr>
-        <w:tc>
-          <w:tcPr>
-            <w:tcW w:w="0" w:type="auto"/>
+        <w:trPr>
+          <w:trHeight w:val="624" w:hRule="atLeast"/>
+        </w:trPr>
+        <w:tc>
+          <w:tcPr>
+            <w:tcW w:w="480" w:type="dxa"/>
             <w:tcBorders>
               <w:top w:val="single" w:sz="6" w:space="0" w:color="000000"/>
               <w:left w:val="single" w:sz="6" w:space="0" w:color="000000"/>
@@ -8164,7 +8743,7 @@
         </w:tc>
         <w:tc>
           <w:tcPr>
-            <w:tcW w:w="0" w:type="auto"/>
+            <w:tcW w:w="4100" w:type="dxa"/>
             <w:tcBorders>
               <w:top w:val="single" w:sz="6" w:space="0" w:color="000000"/>
               <w:left w:val="single" w:sz="6" w:space="0" w:color="000000"/>
@@ -8303,34 +8882,34 @@
         </w:tc>
         <w:tc>
           <w:tcPr>
-            <w:tcW w:w="0" w:type="auto"/>
-            <w:tcBorders>
-              <w:top w:val="single" w:sz="6" w:space="0" w:color="000000"/>
-              <w:left w:val="single" w:sz="6" w:space="0" w:color="000000"/>
-              <w:bottom w:val="single" w:sz="6" w:space="0" w:color="000000"/>
-              <w:right w:val="single" w:sz="6" w:space="0" w:color="000000"/>
-            </w:tcBorders>
-            <w:tcMar>
-              <w:top w:w="120" w:type="dxa"/>
-              <w:left w:w="120" w:type="dxa"/>
-              <w:bottom w:w="120" w:type="dxa"/>
-              <w:right w:w="120" w:type="dxa"/>
-            </w:tcMar>
-            <w:hideMark/>
-          </w:tcPr>
-          <w:p>
-            <w:pPr>
-              <w:spacing w:before="200" w:after="200" w:line="240" w:lineRule="auto"/>
-              <w:rPr>
-                <w:rFonts w:ascii="Times New Roman" w:eastAsia="Times New Roman" w:hAnsi="Times New Roman" w:cs="Times New Roman"/>
-                <w:lang w:eastAsia="en-ID"/>
-              </w:rPr>
-            </w:pPr>
-          </w:p>
-        </w:tc>
-        <w:tc>
-          <w:tcPr>
-            <w:tcW w:w="0" w:type="auto"/>
+            <w:tcW w:w="420" w:type="dxa"/>
+            <w:tcBorders>
+              <w:top w:val="single" w:sz="6" w:space="0" w:color="000000"/>
+              <w:left w:val="single" w:sz="6" w:space="0" w:color="000000"/>
+              <w:bottom w:val="single" w:sz="6" w:space="0" w:color="000000"/>
+              <w:right w:val="single" w:sz="6" w:space="0" w:color="000000"/>
+            </w:tcBorders>
+            <w:tcMar>
+              <w:top w:w="120" w:type="dxa"/>
+              <w:left w:w="120" w:type="dxa"/>
+              <w:bottom w:w="120" w:type="dxa"/>
+              <w:right w:w="120" w:type="dxa"/>
+            </w:tcMar>
+            <w:hideMark/>
+          </w:tcPr>
+          <w:p>
+            <w:pPr>
+              <w:spacing w:before="200" w:after="200" w:line="240" w:lineRule="auto"/>
+              <w:rPr>
+                <w:rFonts w:ascii="Times New Roman" w:eastAsia="Times New Roman" w:hAnsi="Times New Roman" w:cs="Times New Roman"/>
+                <w:lang w:eastAsia="en-ID"/>
+              </w:rPr>
+            </w:pPr>
+          </w:p>
+        </w:tc>
+        <w:tc>
+          <w:tcPr>
+            <w:tcW w:w="420" w:type="dxa"/>
             <w:tcBorders>
               <w:top w:val="single" w:sz="6" w:space="0" w:color="000000"/>
               <w:left w:val="single" w:sz="6" w:space="0" w:color="000000"/>
@@ -8359,7 +8938,7 @@
         </w:tc>
         <w:tc>
           <w:tcPr>
-            <w:tcW w:w="0" w:type="auto"/>
+            <w:tcW w:w="420" w:type="dxa"/>
             <w:tcBorders>
               <w:top w:val="single" w:sz="6" w:space="0" w:color="000000"/>
               <w:left w:val="single" w:sz="6" w:space="0" w:color="000000"/>
@@ -8388,7 +8967,7 @@
         </w:tc>
         <w:tc>
           <w:tcPr>
-            <w:tcW w:w="0" w:type="auto"/>
+            <w:tcW w:w="420" w:type="dxa"/>
             <w:tcBorders>
               <w:top w:val="single" w:sz="6" w:space="0" w:color="000000"/>
               <w:left w:val="single" w:sz="6" w:space="0" w:color="000000"/>
@@ -8415,11 +8994,41 @@
             </w:pPr>
           </w:p>
         </w:tc>
+        <w:tc>
+          <w:tcPr>
+            <w:tcW w:w="2766" w:type="dxa"/>
+            <w:tcBorders>
+              <w:top w:val="single" w:sz="6" w:space="0" w:color="000000"/>
+              <w:left w:val="single" w:sz="6" w:space="0" w:color="000000"/>
+              <w:bottom w:val="single" w:sz="6" w:space="0" w:color="000000"/>
+              <w:right w:val="single" w:sz="6" w:space="0" w:color="000000"/>
+            </w:tcBorders>
+            <w:tcMar>
+              <w:top w:w="120" w:type="dxa"/>
+              <w:left w:w="120" w:type="dxa"/>
+              <w:bottom w:w="120" w:type="dxa"/>
+              <w:right w:w="120" w:type="dxa"/>
+            </w:tcMar>
+            <w:hideMark/>
+          </w:tcPr>
+          <w:p>
+            <w:pPr>
+              <w:spacing w:before="200" w:after="200" w:line="240" w:lineRule="auto"/>
+              <w:rPr>
+                <w:rFonts w:ascii="Times New Roman" w:eastAsia="Times New Roman" w:hAnsi="Times New Roman" w:cs="Times New Roman"/>
+                <w:lang w:eastAsia="en-ID"/>
+              </w:rPr>
+            </w:pPr>
+          </w:p>
+        </w:tc>
       </w:tr>
       <w:tr>
-        <w:tc>
-          <w:tcPr>
-            <w:tcW w:w="0" w:type="auto"/>
+        <w:trPr>
+          <w:trHeight w:val="624" w:hRule="atLeast"/>
+        </w:trPr>
+        <w:tc>
+          <w:tcPr>
+            <w:tcW w:w="480" w:type="dxa"/>
             <w:tcBorders>
               <w:top w:val="single" w:sz="6" w:space="0" w:color="000000"/>
               <w:left w:val="single" w:sz="6" w:space="0" w:color="000000"/>
@@ -8454,7 +9063,7 @@
         </w:tc>
         <w:tc>
           <w:tcPr>
-            <w:tcW w:w="0" w:type="auto"/>
+            <w:tcW w:w="4100" w:type="dxa"/>
             <w:tcBorders>
               <w:top w:val="single" w:sz="6" w:space="0" w:color="000000"/>
               <w:left w:val="single" w:sz="6" w:space="0" w:color="000000"/>
@@ -8634,34 +9243,34 @@
         </w:tc>
         <w:tc>
           <w:tcPr>
-            <w:tcW w:w="0" w:type="auto"/>
-            <w:tcBorders>
-              <w:top w:val="single" w:sz="6" w:space="0" w:color="000000"/>
-              <w:left w:val="single" w:sz="6" w:space="0" w:color="000000"/>
-              <w:bottom w:val="single" w:sz="6" w:space="0" w:color="000000"/>
-              <w:right w:val="single" w:sz="6" w:space="0" w:color="000000"/>
-            </w:tcBorders>
-            <w:tcMar>
-              <w:top w:w="120" w:type="dxa"/>
-              <w:left w:w="120" w:type="dxa"/>
-              <w:bottom w:w="120" w:type="dxa"/>
-              <w:right w:w="120" w:type="dxa"/>
-            </w:tcMar>
-            <w:hideMark/>
-          </w:tcPr>
-          <w:p>
-            <w:pPr>
-              <w:spacing w:before="200" w:after="200" w:line="240" w:lineRule="auto"/>
-              <w:rPr>
-                <w:rFonts w:ascii="Times New Roman" w:eastAsia="Times New Roman" w:hAnsi="Times New Roman" w:cs="Times New Roman"/>
-                <w:lang w:eastAsia="en-ID"/>
-              </w:rPr>
-            </w:pPr>
-          </w:p>
-        </w:tc>
-        <w:tc>
-          <w:tcPr>
-            <w:tcW w:w="0" w:type="auto"/>
+            <w:tcW w:w="420" w:type="dxa"/>
+            <w:tcBorders>
+              <w:top w:val="single" w:sz="6" w:space="0" w:color="000000"/>
+              <w:left w:val="single" w:sz="6" w:space="0" w:color="000000"/>
+              <w:bottom w:val="single" w:sz="6" w:space="0" w:color="000000"/>
+              <w:right w:val="single" w:sz="6" w:space="0" w:color="000000"/>
+            </w:tcBorders>
+            <w:tcMar>
+              <w:top w:w="120" w:type="dxa"/>
+              <w:left w:w="120" w:type="dxa"/>
+              <w:bottom w:w="120" w:type="dxa"/>
+              <w:right w:w="120" w:type="dxa"/>
+            </w:tcMar>
+            <w:hideMark/>
+          </w:tcPr>
+          <w:p>
+            <w:pPr>
+              <w:spacing w:before="200" w:after="200" w:line="240" w:lineRule="auto"/>
+              <w:rPr>
+                <w:rFonts w:ascii="Times New Roman" w:eastAsia="Times New Roman" w:hAnsi="Times New Roman" w:cs="Times New Roman"/>
+                <w:lang w:eastAsia="en-ID"/>
+              </w:rPr>
+            </w:pPr>
+          </w:p>
+        </w:tc>
+        <w:tc>
+          <w:tcPr>
+            <w:tcW w:w="420" w:type="dxa"/>
             <w:tcBorders>
               <w:top w:val="single" w:sz="6" w:space="0" w:color="000000"/>
               <w:left w:val="single" w:sz="6" w:space="0" w:color="000000"/>
@@ -8690,7 +9299,7 @@
         </w:tc>
         <w:tc>
           <w:tcPr>
-            <w:tcW w:w="0" w:type="auto"/>
+            <w:tcW w:w="420" w:type="dxa"/>
             <w:tcBorders>
               <w:top w:val="single" w:sz="6" w:space="0" w:color="000000"/>
               <w:left w:val="single" w:sz="6" w:space="0" w:color="000000"/>
@@ -8719,7 +9328,7 @@
         </w:tc>
         <w:tc>
           <w:tcPr>
-            <w:tcW w:w="0" w:type="auto"/>
+            <w:tcW w:w="420" w:type="dxa"/>
             <w:tcBorders>
               <w:top w:val="single" w:sz="6" w:space="0" w:color="000000"/>
               <w:left w:val="single" w:sz="6" w:space="0" w:color="000000"/>
@@ -8741,6 +9350,33 @@
                 <w:rFonts w:ascii="Times New Roman" w:eastAsia="Times New Roman" w:hAnsi="Times New Roman" w:cs="Times New Roman"/>
                 <w:sz w:val="20"/>
                 <w:szCs w:val="20"/>
+                <w:lang w:eastAsia="en-ID"/>
+              </w:rPr>
+            </w:pPr>
+          </w:p>
+        </w:tc>
+        <w:tc>
+          <w:tcPr>
+            <w:tcW w:w="2766" w:type="dxa"/>
+            <w:tcBorders>
+              <w:top w:val="single" w:sz="6" w:space="0" w:color="000000"/>
+              <w:left w:val="single" w:sz="6" w:space="0" w:color="000000"/>
+              <w:bottom w:val="single" w:sz="6" w:space="0" w:color="000000"/>
+              <w:right w:val="single" w:sz="6" w:space="0" w:color="000000"/>
+            </w:tcBorders>
+            <w:tcMar>
+              <w:top w:w="120" w:type="dxa"/>
+              <w:left w:w="120" w:type="dxa"/>
+              <w:bottom w:w="120" w:type="dxa"/>
+              <w:right w:w="120" w:type="dxa"/>
+            </w:tcMar>
+            <w:hideMark/>
+          </w:tcPr>
+          <w:p>
+            <w:pPr>
+              <w:spacing w:before="200" w:after="200" w:line="240" w:lineRule="auto"/>
+              <w:rPr>
+                <w:rFonts w:ascii="Times New Roman" w:eastAsia="Times New Roman" w:hAnsi="Times New Roman" w:cs="Times New Roman"/>
                 <w:lang w:eastAsia="en-ID"/>
               </w:rPr>
             </w:pPr>
@@ -9100,7 +9736,7 @@
     </w:p>
     <w:tbl>
       <w:tblPr>
-        <w:tblW w:w="4605" w:type="pct"/>
+        <w:tblW w:w="9026" w:type="dxa"/>
         <w:tblBorders>
           <w:top w:val="single" w:sz="6" w:space="0" w:color="000000"/>
           <w:left w:val="single" w:sz="6" w:space="0" w:color="000000"/>
@@ -9116,17 +9752,18 @@
         <w:tblLook w:val="04A0" w:firstRow="1" w:lastRow="0" w:firstColumn="1" w:lastColumn="0" w:noHBand="0" w:noVBand="1"/>
       </w:tblPr>
       <w:tblGrid>
-        <w:gridCol w:w="510"/>
-        <w:gridCol w:w="4948"/>
-        <w:gridCol w:w="710"/>
-        <w:gridCol w:w="710"/>
-        <w:gridCol w:w="710"/>
-        <w:gridCol w:w="710"/>
+        <w:gridCol w:w="480"/>
+        <w:gridCol w:w="4100"/>
+        <w:gridCol w:w="420"/>
+        <w:gridCol w:w="420"/>
+        <w:gridCol w:w="420"/>
+        <w:gridCol w:w="420"/>
+        <w:gridCol w:w="2766"/>
       </w:tblGrid>
       <w:tr>
         <w:tc>
           <w:tcPr>
-            <w:tcW w:w="307" w:type="pct"/>
+            <w:tcW w:w="480" w:type="dxa"/>
             <w:tcBorders>
               <w:top w:val="single" w:sz="6" w:space="0" w:color="000000"/>
               <w:left w:val="single" w:sz="6" w:space="0" w:color="000000"/>
@@ -9167,7 +9804,7 @@
         </w:tc>
         <w:tc>
           <w:tcPr>
-            <w:tcW w:w="2980" w:type="pct"/>
+            <w:tcW w:w="4100" w:type="dxa"/>
             <w:tcBorders>
               <w:top w:val="single" w:sz="6" w:space="0" w:color="000000"/>
               <w:left w:val="single" w:sz="6" w:space="0" w:color="000000"/>
@@ -9210,7 +9847,7 @@
         </w:tc>
         <w:tc>
           <w:tcPr>
-            <w:tcW w:w="428" w:type="pct"/>
+            <w:tcW w:w="420" w:type="dxa"/>
             <w:tcBorders>
               <w:top w:val="single" w:sz="6" w:space="0" w:color="000000"/>
               <w:left w:val="single" w:sz="6" w:space="0" w:color="000000"/>
@@ -9251,7 +9888,7 @@
         </w:tc>
         <w:tc>
           <w:tcPr>
-            <w:tcW w:w="428" w:type="pct"/>
+            <w:tcW w:w="420" w:type="dxa"/>
             <w:tcBorders>
               <w:top w:val="single" w:sz="6" w:space="0" w:color="000000"/>
               <w:left w:val="single" w:sz="6" w:space="0" w:color="000000"/>
@@ -9292,7 +9929,7 @@
         </w:tc>
         <w:tc>
           <w:tcPr>
-            <w:tcW w:w="428" w:type="pct"/>
+            <w:tcW w:w="420" w:type="dxa"/>
             <w:tcBorders>
               <w:top w:val="single" w:sz="6" w:space="0" w:color="000000"/>
               <w:left w:val="single" w:sz="6" w:space="0" w:color="000000"/>
@@ -9333,7 +9970,7 @@
         </w:tc>
         <w:tc>
           <w:tcPr>
-            <w:tcW w:w="428" w:type="pct"/>
+            <w:tcW w:w="420" w:type="dxa"/>
             <w:tcBorders>
               <w:top w:val="single" w:sz="6" w:space="0" w:color="000000"/>
               <w:left w:val="single" w:sz="6" w:space="0" w:color="000000"/>
@@ -9372,11 +10009,55 @@
             </w:r>
           </w:p>
         </w:tc>
+        <w:tc>
+          <w:tcPr>
+            <w:tcW w:w="2766" w:type="dxa"/>
+            <w:tcBorders>
+              <w:top w:val="single" w:sz="6" w:space="0" w:color="000000"/>
+              <w:left w:val="single" w:sz="6" w:space="0" w:color="000000"/>
+              <w:bottom w:val="single" w:sz="6" w:space="0" w:color="000000"/>
+              <w:right w:val="single" w:sz="6" w:space="0" w:color="000000"/>
+            </w:tcBorders>
+            <w:shd w:val="clear" w:color="auto" w:fill="F0F0F0"/>
+            <w:tcMar>
+              <w:top w:w="120" w:type="dxa"/>
+              <w:left w:w="120" w:type="dxa"/>
+              <w:bottom w:w="120" w:type="dxa"/>
+              <w:right w:w="120" w:type="dxa"/>
+            </w:tcMar>
+            <w:vAlign w:val="center"/>
+            <w:hideMark/>
+          </w:tcPr>
+          <w:p>
+            <w:pPr>
+              <w:spacing w:before="200" w:after="200" w:line="240" w:lineRule="auto"/>
+              <w:jc w:val="center"/>
+              <w:rPr>
+                <w:rFonts w:ascii="Times New Roman" w:eastAsia="Times New Roman" w:hAnsi="Times New Roman" w:cs="Times New Roman"/>
+                <w:b/>
+                <w:bCs/>
+                <w:lang w:eastAsia="en-ID"/>
+              </w:rPr>
+            </w:pPr>
+            <w:r>
+              <w:rPr>
+                <w:rFonts w:ascii="Times New Roman" w:eastAsia="Times New Roman" w:hAnsi="Times New Roman" w:cs="Times New Roman"/>
+                <w:b/>
+                <w:bCs/>
+                <w:lang w:eastAsia="en-ID"/>
+              </w:rPr>
+              <w:t>Catatan</w:t>
+            </w:r>
+          </w:p>
+        </w:tc>
       </w:tr>
       <w:tr>
-        <w:tc>
-          <w:tcPr>
-            <w:tcW w:w="0" w:type="auto"/>
+        <w:trPr>
+          <w:trHeight w:val="624" w:hRule="atLeast"/>
+        </w:trPr>
+        <w:tc>
+          <w:tcPr>
+            <w:tcW w:w="480" w:type="dxa"/>
             <w:tcBorders>
               <w:top w:val="single" w:sz="6" w:space="0" w:color="000000"/>
               <w:left w:val="single" w:sz="6" w:space="0" w:color="000000"/>
@@ -9411,7 +10092,7 @@
         </w:tc>
         <w:tc>
           <w:tcPr>
-            <w:tcW w:w="0" w:type="auto"/>
+            <w:tcW w:w="4100" w:type="dxa"/>
             <w:tcBorders>
               <w:top w:val="single" w:sz="6" w:space="0" w:color="000000"/>
               <w:left w:val="single" w:sz="6" w:space="0" w:color="000000"/>
@@ -9527,34 +10208,34 @@
         </w:tc>
         <w:tc>
           <w:tcPr>
-            <w:tcW w:w="0" w:type="auto"/>
-            <w:tcBorders>
-              <w:top w:val="single" w:sz="6" w:space="0" w:color="000000"/>
-              <w:left w:val="single" w:sz="6" w:space="0" w:color="000000"/>
-              <w:bottom w:val="single" w:sz="6" w:space="0" w:color="000000"/>
-              <w:right w:val="single" w:sz="6" w:space="0" w:color="000000"/>
-            </w:tcBorders>
-            <w:tcMar>
-              <w:top w:w="120" w:type="dxa"/>
-              <w:left w:w="120" w:type="dxa"/>
-              <w:bottom w:w="120" w:type="dxa"/>
-              <w:right w:w="120" w:type="dxa"/>
-            </w:tcMar>
-            <w:hideMark/>
-          </w:tcPr>
-          <w:p>
-            <w:pPr>
-              <w:spacing w:before="200" w:after="200" w:line="240" w:lineRule="auto"/>
-              <w:rPr>
-                <w:rFonts w:ascii="Times New Roman" w:eastAsia="Times New Roman" w:hAnsi="Times New Roman" w:cs="Times New Roman"/>
-                <w:lang w:eastAsia="en-ID"/>
-              </w:rPr>
-            </w:pPr>
-          </w:p>
-        </w:tc>
-        <w:tc>
-          <w:tcPr>
-            <w:tcW w:w="0" w:type="auto"/>
+            <w:tcW w:w="420" w:type="dxa"/>
+            <w:tcBorders>
+              <w:top w:val="single" w:sz="6" w:space="0" w:color="000000"/>
+              <w:left w:val="single" w:sz="6" w:space="0" w:color="000000"/>
+              <w:bottom w:val="single" w:sz="6" w:space="0" w:color="000000"/>
+              <w:right w:val="single" w:sz="6" w:space="0" w:color="000000"/>
+            </w:tcBorders>
+            <w:tcMar>
+              <w:top w:w="120" w:type="dxa"/>
+              <w:left w:w="120" w:type="dxa"/>
+              <w:bottom w:w="120" w:type="dxa"/>
+              <w:right w:w="120" w:type="dxa"/>
+            </w:tcMar>
+            <w:hideMark/>
+          </w:tcPr>
+          <w:p>
+            <w:pPr>
+              <w:spacing w:before="200" w:after="200" w:line="240" w:lineRule="auto"/>
+              <w:rPr>
+                <w:rFonts w:ascii="Times New Roman" w:eastAsia="Times New Roman" w:hAnsi="Times New Roman" w:cs="Times New Roman"/>
+                <w:lang w:eastAsia="en-ID"/>
+              </w:rPr>
+            </w:pPr>
+          </w:p>
+        </w:tc>
+        <w:tc>
+          <w:tcPr>
+            <w:tcW w:w="420" w:type="dxa"/>
             <w:tcBorders>
               <w:top w:val="single" w:sz="6" w:space="0" w:color="000000"/>
               <w:left w:val="single" w:sz="6" w:space="0" w:color="000000"/>
@@ -9583,7 +10264,7 @@
         </w:tc>
         <w:tc>
           <w:tcPr>
-            <w:tcW w:w="0" w:type="auto"/>
+            <w:tcW w:w="420" w:type="dxa"/>
             <w:tcBorders>
               <w:top w:val="single" w:sz="6" w:space="0" w:color="000000"/>
               <w:left w:val="single" w:sz="6" w:space="0" w:color="000000"/>
@@ -9612,7 +10293,7 @@
         </w:tc>
         <w:tc>
           <w:tcPr>
-            <w:tcW w:w="0" w:type="auto"/>
+            <w:tcW w:w="420" w:type="dxa"/>
             <w:tcBorders>
               <w:top w:val="single" w:sz="6" w:space="0" w:color="000000"/>
               <w:left w:val="single" w:sz="6" w:space="0" w:color="000000"/>
@@ -9639,11 +10320,41 @@
             </w:pPr>
           </w:p>
         </w:tc>
+        <w:tc>
+          <w:tcPr>
+            <w:tcW w:w="2766" w:type="dxa"/>
+            <w:tcBorders>
+              <w:top w:val="single" w:sz="6" w:space="0" w:color="000000"/>
+              <w:left w:val="single" w:sz="6" w:space="0" w:color="000000"/>
+              <w:bottom w:val="single" w:sz="6" w:space="0" w:color="000000"/>
+              <w:right w:val="single" w:sz="6" w:space="0" w:color="000000"/>
+            </w:tcBorders>
+            <w:tcMar>
+              <w:top w:w="120" w:type="dxa"/>
+              <w:left w:w="120" w:type="dxa"/>
+              <w:bottom w:w="120" w:type="dxa"/>
+              <w:right w:w="120" w:type="dxa"/>
+            </w:tcMar>
+            <w:hideMark/>
+          </w:tcPr>
+          <w:p>
+            <w:pPr>
+              <w:spacing w:before="200" w:after="200" w:line="240" w:lineRule="auto"/>
+              <w:rPr>
+                <w:rFonts w:ascii="Times New Roman" w:eastAsia="Times New Roman" w:hAnsi="Times New Roman" w:cs="Times New Roman"/>
+                <w:lang w:eastAsia="en-ID"/>
+              </w:rPr>
+            </w:pPr>
+          </w:p>
+        </w:tc>
       </w:tr>
       <w:tr>
-        <w:tc>
-          <w:tcPr>
-            <w:tcW w:w="0" w:type="auto"/>
+        <w:trPr>
+          <w:trHeight w:val="624" w:hRule="atLeast"/>
+        </w:trPr>
+        <w:tc>
+          <w:tcPr>
+            <w:tcW w:w="480" w:type="dxa"/>
             <w:tcBorders>
               <w:top w:val="single" w:sz="6" w:space="0" w:color="000000"/>
               <w:left w:val="single" w:sz="6" w:space="0" w:color="000000"/>
@@ -9678,7 +10389,7 @@
         </w:tc>
         <w:tc>
           <w:tcPr>
-            <w:tcW w:w="0" w:type="auto"/>
+            <w:tcW w:w="4100" w:type="dxa"/>
             <w:tcBorders>
               <w:top w:val="single" w:sz="6" w:space="0" w:color="000000"/>
               <w:left w:val="single" w:sz="6" w:space="0" w:color="000000"/>
@@ -9826,34 +10537,34 @@
         </w:tc>
         <w:tc>
           <w:tcPr>
-            <w:tcW w:w="0" w:type="auto"/>
-            <w:tcBorders>
-              <w:top w:val="single" w:sz="6" w:space="0" w:color="000000"/>
-              <w:left w:val="single" w:sz="6" w:space="0" w:color="000000"/>
-              <w:bottom w:val="single" w:sz="6" w:space="0" w:color="000000"/>
-              <w:right w:val="single" w:sz="6" w:space="0" w:color="000000"/>
-            </w:tcBorders>
-            <w:tcMar>
-              <w:top w:w="120" w:type="dxa"/>
-              <w:left w:w="120" w:type="dxa"/>
-              <w:bottom w:w="120" w:type="dxa"/>
-              <w:right w:w="120" w:type="dxa"/>
-            </w:tcMar>
-            <w:hideMark/>
-          </w:tcPr>
-          <w:p>
-            <w:pPr>
-              <w:spacing w:before="200" w:after="200" w:line="240" w:lineRule="auto"/>
-              <w:rPr>
-                <w:rFonts w:ascii="Times New Roman" w:eastAsia="Times New Roman" w:hAnsi="Times New Roman" w:cs="Times New Roman"/>
-                <w:lang w:eastAsia="en-ID"/>
-              </w:rPr>
-            </w:pPr>
-          </w:p>
-        </w:tc>
-        <w:tc>
-          <w:tcPr>
-            <w:tcW w:w="0" w:type="auto"/>
+            <w:tcW w:w="420" w:type="dxa"/>
+            <w:tcBorders>
+              <w:top w:val="single" w:sz="6" w:space="0" w:color="000000"/>
+              <w:left w:val="single" w:sz="6" w:space="0" w:color="000000"/>
+              <w:bottom w:val="single" w:sz="6" w:space="0" w:color="000000"/>
+              <w:right w:val="single" w:sz="6" w:space="0" w:color="000000"/>
+            </w:tcBorders>
+            <w:tcMar>
+              <w:top w:w="120" w:type="dxa"/>
+              <w:left w:w="120" w:type="dxa"/>
+              <w:bottom w:w="120" w:type="dxa"/>
+              <w:right w:w="120" w:type="dxa"/>
+            </w:tcMar>
+            <w:hideMark/>
+          </w:tcPr>
+          <w:p>
+            <w:pPr>
+              <w:spacing w:before="200" w:after="200" w:line="240" w:lineRule="auto"/>
+              <w:rPr>
+                <w:rFonts w:ascii="Times New Roman" w:eastAsia="Times New Roman" w:hAnsi="Times New Roman" w:cs="Times New Roman"/>
+                <w:lang w:eastAsia="en-ID"/>
+              </w:rPr>
+            </w:pPr>
+          </w:p>
+        </w:tc>
+        <w:tc>
+          <w:tcPr>
+            <w:tcW w:w="420" w:type="dxa"/>
             <w:tcBorders>
               <w:top w:val="single" w:sz="6" w:space="0" w:color="000000"/>
               <w:left w:val="single" w:sz="6" w:space="0" w:color="000000"/>
@@ -9882,7 +10593,7 @@
         </w:tc>
         <w:tc>
           <w:tcPr>
-            <w:tcW w:w="0" w:type="auto"/>
+            <w:tcW w:w="420" w:type="dxa"/>
             <w:tcBorders>
               <w:top w:val="single" w:sz="6" w:space="0" w:color="000000"/>
               <w:left w:val="single" w:sz="6" w:space="0" w:color="000000"/>
@@ -9911,7 +10622,7 @@
         </w:tc>
         <w:tc>
           <w:tcPr>
-            <w:tcW w:w="0" w:type="auto"/>
+            <w:tcW w:w="420" w:type="dxa"/>
             <w:tcBorders>
               <w:top w:val="single" w:sz="6" w:space="0" w:color="000000"/>
               <w:left w:val="single" w:sz="6" w:space="0" w:color="000000"/>
@@ -9938,11 +10649,41 @@
             </w:pPr>
           </w:p>
         </w:tc>
+        <w:tc>
+          <w:tcPr>
+            <w:tcW w:w="2766" w:type="dxa"/>
+            <w:tcBorders>
+              <w:top w:val="single" w:sz="6" w:space="0" w:color="000000"/>
+              <w:left w:val="single" w:sz="6" w:space="0" w:color="000000"/>
+              <w:bottom w:val="single" w:sz="6" w:space="0" w:color="000000"/>
+              <w:right w:val="single" w:sz="6" w:space="0" w:color="000000"/>
+            </w:tcBorders>
+            <w:tcMar>
+              <w:top w:w="120" w:type="dxa"/>
+              <w:left w:w="120" w:type="dxa"/>
+              <w:bottom w:w="120" w:type="dxa"/>
+              <w:right w:w="120" w:type="dxa"/>
+            </w:tcMar>
+            <w:hideMark/>
+          </w:tcPr>
+          <w:p>
+            <w:pPr>
+              <w:spacing w:before="200" w:after="200" w:line="240" w:lineRule="auto"/>
+              <w:rPr>
+                <w:rFonts w:ascii="Times New Roman" w:eastAsia="Times New Roman" w:hAnsi="Times New Roman" w:cs="Times New Roman"/>
+                <w:lang w:eastAsia="en-ID"/>
+              </w:rPr>
+            </w:pPr>
+          </w:p>
+        </w:tc>
       </w:tr>
       <w:tr>
-        <w:tc>
-          <w:tcPr>
-            <w:tcW w:w="0" w:type="auto"/>
+        <w:trPr>
+          <w:trHeight w:val="624" w:hRule="atLeast"/>
+        </w:trPr>
+        <w:tc>
+          <w:tcPr>
+            <w:tcW w:w="480" w:type="dxa"/>
             <w:tcBorders>
               <w:top w:val="single" w:sz="6" w:space="0" w:color="000000"/>
               <w:left w:val="single" w:sz="6" w:space="0" w:color="000000"/>
@@ -9977,7 +10718,7 @@
         </w:tc>
         <w:tc>
           <w:tcPr>
-            <w:tcW w:w="0" w:type="auto"/>
+            <w:tcW w:w="4100" w:type="dxa"/>
             <w:tcBorders>
               <w:top w:val="single" w:sz="6" w:space="0" w:color="000000"/>
               <w:left w:val="single" w:sz="6" w:space="0" w:color="000000"/>
@@ -10164,34 +10905,34 @@
         </w:tc>
         <w:tc>
           <w:tcPr>
-            <w:tcW w:w="0" w:type="auto"/>
-            <w:tcBorders>
-              <w:top w:val="single" w:sz="6" w:space="0" w:color="000000"/>
-              <w:left w:val="single" w:sz="6" w:space="0" w:color="000000"/>
-              <w:bottom w:val="single" w:sz="6" w:space="0" w:color="000000"/>
-              <w:right w:val="single" w:sz="6" w:space="0" w:color="000000"/>
-            </w:tcBorders>
-            <w:tcMar>
-              <w:top w:w="120" w:type="dxa"/>
-              <w:left w:w="120" w:type="dxa"/>
-              <w:bottom w:w="120" w:type="dxa"/>
-              <w:right w:w="120" w:type="dxa"/>
-            </w:tcMar>
-            <w:hideMark/>
-          </w:tcPr>
-          <w:p>
-            <w:pPr>
-              <w:spacing w:before="200" w:after="200" w:line="240" w:lineRule="auto"/>
-              <w:rPr>
-                <w:rFonts w:ascii="Times New Roman" w:eastAsia="Times New Roman" w:hAnsi="Times New Roman" w:cs="Times New Roman"/>
-                <w:lang w:eastAsia="en-ID"/>
-              </w:rPr>
-            </w:pPr>
-          </w:p>
-        </w:tc>
-        <w:tc>
-          <w:tcPr>
-            <w:tcW w:w="0" w:type="auto"/>
+            <w:tcW w:w="420" w:type="dxa"/>
+            <w:tcBorders>
+              <w:top w:val="single" w:sz="6" w:space="0" w:color="000000"/>
+              <w:left w:val="single" w:sz="6" w:space="0" w:color="000000"/>
+              <w:bottom w:val="single" w:sz="6" w:space="0" w:color="000000"/>
+              <w:right w:val="single" w:sz="6" w:space="0" w:color="000000"/>
+            </w:tcBorders>
+            <w:tcMar>
+              <w:top w:w="120" w:type="dxa"/>
+              <w:left w:w="120" w:type="dxa"/>
+              <w:bottom w:w="120" w:type="dxa"/>
+              <w:right w:w="120" w:type="dxa"/>
+            </w:tcMar>
+            <w:hideMark/>
+          </w:tcPr>
+          <w:p>
+            <w:pPr>
+              <w:spacing w:before="200" w:after="200" w:line="240" w:lineRule="auto"/>
+              <w:rPr>
+                <w:rFonts w:ascii="Times New Roman" w:eastAsia="Times New Roman" w:hAnsi="Times New Roman" w:cs="Times New Roman"/>
+                <w:lang w:eastAsia="en-ID"/>
+              </w:rPr>
+            </w:pPr>
+          </w:p>
+        </w:tc>
+        <w:tc>
+          <w:tcPr>
+            <w:tcW w:w="420" w:type="dxa"/>
             <w:tcBorders>
               <w:top w:val="single" w:sz="6" w:space="0" w:color="000000"/>
               <w:left w:val="single" w:sz="6" w:space="0" w:color="000000"/>
@@ -10220,7 +10961,7 @@
         </w:tc>
         <w:tc>
           <w:tcPr>
-            <w:tcW w:w="0" w:type="auto"/>
+            <w:tcW w:w="420" w:type="dxa"/>
             <w:tcBorders>
               <w:top w:val="single" w:sz="6" w:space="0" w:color="000000"/>
               <w:left w:val="single" w:sz="6" w:space="0" w:color="000000"/>
@@ -10249,7 +10990,7 @@
         </w:tc>
         <w:tc>
           <w:tcPr>
-            <w:tcW w:w="0" w:type="auto"/>
+            <w:tcW w:w="420" w:type="dxa"/>
             <w:tcBorders>
               <w:top w:val="single" w:sz="6" w:space="0" w:color="000000"/>
               <w:left w:val="single" w:sz="6" w:space="0" w:color="000000"/>
@@ -10276,11 +11017,41 @@
             </w:pPr>
           </w:p>
         </w:tc>
+        <w:tc>
+          <w:tcPr>
+            <w:tcW w:w="2766" w:type="dxa"/>
+            <w:tcBorders>
+              <w:top w:val="single" w:sz="6" w:space="0" w:color="000000"/>
+              <w:left w:val="single" w:sz="6" w:space="0" w:color="000000"/>
+              <w:bottom w:val="single" w:sz="6" w:space="0" w:color="000000"/>
+              <w:right w:val="single" w:sz="6" w:space="0" w:color="000000"/>
+            </w:tcBorders>
+            <w:tcMar>
+              <w:top w:w="120" w:type="dxa"/>
+              <w:left w:w="120" w:type="dxa"/>
+              <w:bottom w:w="120" w:type="dxa"/>
+              <w:right w:w="120" w:type="dxa"/>
+            </w:tcMar>
+            <w:hideMark/>
+          </w:tcPr>
+          <w:p>
+            <w:pPr>
+              <w:spacing w:before="200" w:after="200" w:line="240" w:lineRule="auto"/>
+              <w:rPr>
+                <w:rFonts w:ascii="Times New Roman" w:eastAsia="Times New Roman" w:hAnsi="Times New Roman" w:cs="Times New Roman"/>
+                <w:lang w:eastAsia="en-ID"/>
+              </w:rPr>
+            </w:pPr>
+          </w:p>
+        </w:tc>
       </w:tr>
       <w:tr>
-        <w:tc>
-          <w:tcPr>
-            <w:tcW w:w="0" w:type="auto"/>
+        <w:trPr>
+          <w:trHeight w:val="624" w:hRule="atLeast"/>
+        </w:trPr>
+        <w:tc>
+          <w:tcPr>
+            <w:tcW w:w="480" w:type="dxa"/>
             <w:tcBorders>
               <w:top w:val="single" w:sz="6" w:space="0" w:color="000000"/>
               <w:left w:val="single" w:sz="6" w:space="0" w:color="000000"/>
@@ -10315,7 +11086,7 @@
         </w:tc>
         <w:tc>
           <w:tcPr>
-            <w:tcW w:w="0" w:type="auto"/>
+            <w:tcW w:w="4100" w:type="dxa"/>
             <w:tcBorders>
               <w:top w:val="single" w:sz="6" w:space="0" w:color="000000"/>
               <w:left w:val="single" w:sz="6" w:space="0" w:color="000000"/>
@@ -10495,34 +11266,34 @@
         </w:tc>
         <w:tc>
           <w:tcPr>
-            <w:tcW w:w="0" w:type="auto"/>
-            <w:tcBorders>
-              <w:top w:val="single" w:sz="6" w:space="0" w:color="000000"/>
-              <w:left w:val="single" w:sz="6" w:space="0" w:color="000000"/>
-              <w:bottom w:val="single" w:sz="6" w:space="0" w:color="000000"/>
-              <w:right w:val="single" w:sz="6" w:space="0" w:color="000000"/>
-            </w:tcBorders>
-            <w:tcMar>
-              <w:top w:w="120" w:type="dxa"/>
-              <w:left w:w="120" w:type="dxa"/>
-              <w:bottom w:w="120" w:type="dxa"/>
-              <w:right w:w="120" w:type="dxa"/>
-            </w:tcMar>
-            <w:hideMark/>
-          </w:tcPr>
-          <w:p>
-            <w:pPr>
-              <w:spacing w:before="200" w:after="200" w:line="240" w:lineRule="auto"/>
-              <w:rPr>
-                <w:rFonts w:ascii="Times New Roman" w:eastAsia="Times New Roman" w:hAnsi="Times New Roman" w:cs="Times New Roman"/>
-                <w:lang w:eastAsia="en-ID"/>
-              </w:rPr>
-            </w:pPr>
-          </w:p>
-        </w:tc>
-        <w:tc>
-          <w:tcPr>
-            <w:tcW w:w="0" w:type="auto"/>
+            <w:tcW w:w="420" w:type="dxa"/>
+            <w:tcBorders>
+              <w:top w:val="single" w:sz="6" w:space="0" w:color="000000"/>
+              <w:left w:val="single" w:sz="6" w:space="0" w:color="000000"/>
+              <w:bottom w:val="single" w:sz="6" w:space="0" w:color="000000"/>
+              <w:right w:val="single" w:sz="6" w:space="0" w:color="000000"/>
+            </w:tcBorders>
+            <w:tcMar>
+              <w:top w:w="120" w:type="dxa"/>
+              <w:left w:w="120" w:type="dxa"/>
+              <w:bottom w:w="120" w:type="dxa"/>
+              <w:right w:w="120" w:type="dxa"/>
+            </w:tcMar>
+            <w:hideMark/>
+          </w:tcPr>
+          <w:p>
+            <w:pPr>
+              <w:spacing w:before="200" w:after="200" w:line="240" w:lineRule="auto"/>
+              <w:rPr>
+                <w:rFonts w:ascii="Times New Roman" w:eastAsia="Times New Roman" w:hAnsi="Times New Roman" w:cs="Times New Roman"/>
+                <w:lang w:eastAsia="en-ID"/>
+              </w:rPr>
+            </w:pPr>
+          </w:p>
+        </w:tc>
+        <w:tc>
+          <w:tcPr>
+            <w:tcW w:w="420" w:type="dxa"/>
             <w:tcBorders>
               <w:top w:val="single" w:sz="6" w:space="0" w:color="000000"/>
               <w:left w:val="single" w:sz="6" w:space="0" w:color="000000"/>
@@ -10551,7 +11322,7 @@
         </w:tc>
         <w:tc>
           <w:tcPr>
-            <w:tcW w:w="0" w:type="auto"/>
+            <w:tcW w:w="420" w:type="dxa"/>
             <w:tcBorders>
               <w:top w:val="single" w:sz="6" w:space="0" w:color="000000"/>
               <w:left w:val="single" w:sz="6" w:space="0" w:color="000000"/>
@@ -10580,7 +11351,7 @@
         </w:tc>
         <w:tc>
           <w:tcPr>
-            <w:tcW w:w="0" w:type="auto"/>
+            <w:tcW w:w="420" w:type="dxa"/>
             <w:tcBorders>
               <w:top w:val="single" w:sz="6" w:space="0" w:color="000000"/>
               <w:left w:val="single" w:sz="6" w:space="0" w:color="000000"/>
@@ -10607,11 +11378,41 @@
             </w:pPr>
           </w:p>
         </w:tc>
+        <w:tc>
+          <w:tcPr>
+            <w:tcW w:w="2766" w:type="dxa"/>
+            <w:tcBorders>
+              <w:top w:val="single" w:sz="6" w:space="0" w:color="000000"/>
+              <w:left w:val="single" w:sz="6" w:space="0" w:color="000000"/>
+              <w:bottom w:val="single" w:sz="6" w:space="0" w:color="000000"/>
+              <w:right w:val="single" w:sz="6" w:space="0" w:color="000000"/>
+            </w:tcBorders>
+            <w:tcMar>
+              <w:top w:w="120" w:type="dxa"/>
+              <w:left w:w="120" w:type="dxa"/>
+              <w:bottom w:w="120" w:type="dxa"/>
+              <w:right w:w="120" w:type="dxa"/>
+            </w:tcMar>
+            <w:hideMark/>
+          </w:tcPr>
+          <w:p>
+            <w:pPr>
+              <w:spacing w:before="200" w:after="200" w:line="240" w:lineRule="auto"/>
+              <w:rPr>
+                <w:rFonts w:ascii="Times New Roman" w:eastAsia="Times New Roman" w:hAnsi="Times New Roman" w:cs="Times New Roman"/>
+                <w:lang w:eastAsia="en-ID"/>
+              </w:rPr>
+            </w:pPr>
+          </w:p>
+        </w:tc>
       </w:tr>
       <w:tr>
-        <w:tc>
-          <w:tcPr>
-            <w:tcW w:w="0" w:type="auto"/>
+        <w:trPr>
+          <w:trHeight w:val="624" w:hRule="atLeast"/>
+        </w:trPr>
+        <w:tc>
+          <w:tcPr>
+            <w:tcW w:w="480" w:type="dxa"/>
             <w:tcBorders>
               <w:top w:val="single" w:sz="6" w:space="0" w:color="000000"/>
               <w:left w:val="single" w:sz="6" w:space="0" w:color="000000"/>
@@ -10646,7 +11447,7 @@
         </w:tc>
         <w:tc>
           <w:tcPr>
-            <w:tcW w:w="0" w:type="auto"/>
+            <w:tcW w:w="4100" w:type="dxa"/>
             <w:tcBorders>
               <w:top w:val="single" w:sz="6" w:space="0" w:color="000000"/>
               <w:left w:val="single" w:sz="6" w:space="0" w:color="000000"/>
@@ -10794,34 +11595,34 @@
         </w:tc>
         <w:tc>
           <w:tcPr>
-            <w:tcW w:w="0" w:type="auto"/>
-            <w:tcBorders>
-              <w:top w:val="single" w:sz="6" w:space="0" w:color="000000"/>
-              <w:left w:val="single" w:sz="6" w:space="0" w:color="000000"/>
-              <w:bottom w:val="single" w:sz="6" w:space="0" w:color="000000"/>
-              <w:right w:val="single" w:sz="6" w:space="0" w:color="000000"/>
-            </w:tcBorders>
-            <w:tcMar>
-              <w:top w:w="120" w:type="dxa"/>
-              <w:left w:w="120" w:type="dxa"/>
-              <w:bottom w:w="120" w:type="dxa"/>
-              <w:right w:w="120" w:type="dxa"/>
-            </w:tcMar>
-            <w:hideMark/>
-          </w:tcPr>
-          <w:p>
-            <w:pPr>
-              <w:spacing w:before="200" w:after="200" w:line="240" w:lineRule="auto"/>
-              <w:rPr>
-                <w:rFonts w:ascii="Times New Roman" w:eastAsia="Times New Roman" w:hAnsi="Times New Roman" w:cs="Times New Roman"/>
-                <w:lang w:eastAsia="en-ID"/>
-              </w:rPr>
-            </w:pPr>
-          </w:p>
-        </w:tc>
-        <w:tc>
-          <w:tcPr>
-            <w:tcW w:w="0" w:type="auto"/>
+            <w:tcW w:w="420" w:type="dxa"/>
+            <w:tcBorders>
+              <w:top w:val="single" w:sz="6" w:space="0" w:color="000000"/>
+              <w:left w:val="single" w:sz="6" w:space="0" w:color="000000"/>
+              <w:bottom w:val="single" w:sz="6" w:space="0" w:color="000000"/>
+              <w:right w:val="single" w:sz="6" w:space="0" w:color="000000"/>
+            </w:tcBorders>
+            <w:tcMar>
+              <w:top w:w="120" w:type="dxa"/>
+              <w:left w:w="120" w:type="dxa"/>
+              <w:bottom w:w="120" w:type="dxa"/>
+              <w:right w:w="120" w:type="dxa"/>
+            </w:tcMar>
+            <w:hideMark/>
+          </w:tcPr>
+          <w:p>
+            <w:pPr>
+              <w:spacing w:before="200" w:after="200" w:line="240" w:lineRule="auto"/>
+              <w:rPr>
+                <w:rFonts w:ascii="Times New Roman" w:eastAsia="Times New Roman" w:hAnsi="Times New Roman" w:cs="Times New Roman"/>
+                <w:lang w:eastAsia="en-ID"/>
+              </w:rPr>
+            </w:pPr>
+          </w:p>
+        </w:tc>
+        <w:tc>
+          <w:tcPr>
+            <w:tcW w:w="420" w:type="dxa"/>
             <w:tcBorders>
               <w:top w:val="single" w:sz="6" w:space="0" w:color="000000"/>
               <w:left w:val="single" w:sz="6" w:space="0" w:color="000000"/>
@@ -10850,7 +11651,7 @@
         </w:tc>
         <w:tc>
           <w:tcPr>
-            <w:tcW w:w="0" w:type="auto"/>
+            <w:tcW w:w="420" w:type="dxa"/>
             <w:tcBorders>
               <w:top w:val="single" w:sz="6" w:space="0" w:color="000000"/>
               <w:left w:val="single" w:sz="6" w:space="0" w:color="000000"/>
@@ -10879,7 +11680,7 @@
         </w:tc>
         <w:tc>
           <w:tcPr>
-            <w:tcW w:w="0" w:type="auto"/>
+            <w:tcW w:w="420" w:type="dxa"/>
             <w:tcBorders>
               <w:top w:val="single" w:sz="6" w:space="0" w:color="000000"/>
               <w:left w:val="single" w:sz="6" w:space="0" w:color="000000"/>
@@ -10901,6 +11702,33 @@
                 <w:rFonts w:ascii="Times New Roman" w:eastAsia="Times New Roman" w:hAnsi="Times New Roman" w:cs="Times New Roman"/>
                 <w:sz w:val="20"/>
                 <w:szCs w:val="20"/>
+                <w:lang w:eastAsia="en-ID"/>
+              </w:rPr>
+            </w:pPr>
+          </w:p>
+        </w:tc>
+        <w:tc>
+          <w:tcPr>
+            <w:tcW w:w="2766" w:type="dxa"/>
+            <w:tcBorders>
+              <w:top w:val="single" w:sz="6" w:space="0" w:color="000000"/>
+              <w:left w:val="single" w:sz="6" w:space="0" w:color="000000"/>
+              <w:bottom w:val="single" w:sz="6" w:space="0" w:color="000000"/>
+              <w:right w:val="single" w:sz="6" w:space="0" w:color="000000"/>
+            </w:tcBorders>
+            <w:tcMar>
+              <w:top w:w="120" w:type="dxa"/>
+              <w:left w:w="120" w:type="dxa"/>
+              <w:bottom w:w="120" w:type="dxa"/>
+              <w:right w:w="120" w:type="dxa"/>
+            </w:tcMar>
+            <w:hideMark/>
+          </w:tcPr>
+          <w:p>
+            <w:pPr>
+              <w:spacing w:before="200" w:after="200" w:line="240" w:lineRule="auto"/>
+              <w:rPr>
+                <w:rFonts w:ascii="Times New Roman" w:eastAsia="Times New Roman" w:hAnsi="Times New Roman" w:cs="Times New Roman"/>
                 <w:lang w:eastAsia="en-ID"/>
               </w:rPr>
             </w:pPr>

</xml_diff>